<commit_message>
Add Task 1.1 and 1.2: SQL data load and annual trends analysis
Add Task 1.1 and 1.2: SQL data load and annual trends analysis
</commit_message>
<xml_diff>
--- a/part1_data_analytics/sql_analysis_notes.docx
+++ b/part1_data_analytics/sql_analysis_notes.docx
@@ -158,6 +158,80 @@
     </w:p>
     <w:p>
       <w:pPr>
+        <w:pStyle w:val="NormalWeb"/>
+      </w:pPr>
+      <w:r>
+        <w:t>Loaded Metro_Interstate_Traffic_Volume.csv into a SQLite table traffic_volume (schema in 01_schema.sql) using DB Browser for SQLite's CSV import feature. Verified the load with the following checks, all matching the source CSV</w:t>
+      </w:r>
+    </w:p>
+    <w:p>
+      <w:pPr>
+        <w:pStyle w:val="NormalWeb"/>
+      </w:pPr>
+      <w:r>
+        <w:t>Row count: 48,204 (via SELECT COUNT(*) FROM traffic_volume;)</w:t>
+      </w:r>
+      <w:r>
+        <w:br/>
+        <w:t>Column count: 9, with correct data types (temp/rain_1h/snow_1h as REAL, clouds_all/traffic_volume as INTEGER)</w:t>
+      </w:r>
+      <w:r>
+        <w:br/>
+        <w:t>Min/max traffic_volume: 0 and 7,280, matching the source data</w:t>
+      </w:r>
+    </w:p>
+    <w:p>
+      <w:pPr>
+        <w:rPr>
+          <w:rFonts w:ascii="Times New Roman" w:hAnsi="Times New Roman" w:cs="Times New Roman"/>
+          <w:sz w:val="22"/>
+          <w:szCs w:val="22"/>
+          <w:lang w:val="en-PH"/>
+        </w:rPr>
+      </w:pPr>
+      <w:r>
+        <w:rPr>
+          <w:lang w:val="en-PH"/>
+        </w:rPr>
+        <w:drawing>
+          <wp:inline distT="0" distB="0" distL="0" distR="0" wp14:anchorId="77AACBD0" wp14:editId="6E59D8C8">
+            <wp:extent cx="5731510" cy="2196465"/>
+            <wp:effectExtent l="0" t="0" r="2540" b="0"/>
+            <wp:docPr id="1799318895" name="Picture 1"/>
+            <wp:cNvGraphicFramePr>
+              <a:graphicFrameLocks xmlns:a="http://schemas.openxmlformats.org/drawingml/2006/main" noChangeAspect="1"/>
+            </wp:cNvGraphicFramePr>
+            <a:graphic xmlns:a="http://schemas.openxmlformats.org/drawingml/2006/main">
+              <a:graphicData uri="http://schemas.openxmlformats.org/drawingml/2006/picture">
+                <pic:pic xmlns:pic="http://schemas.openxmlformats.org/drawingml/2006/picture">
+                  <pic:nvPicPr>
+                    <pic:cNvPr id="1799318895" name=""/>
+                    <pic:cNvPicPr/>
+                  </pic:nvPicPr>
+                  <pic:blipFill>
+                    <a:blip r:embed="rId5"/>
+                    <a:stretch>
+                      <a:fillRect/>
+                    </a:stretch>
+                  </pic:blipFill>
+                  <pic:spPr>
+                    <a:xfrm>
+                      <a:off x="0" y="0"/>
+                      <a:ext cx="5731510" cy="2196465"/>
+                    </a:xfrm>
+                    <a:prstGeom prst="rect">
+                      <a:avLst/>
+                    </a:prstGeom>
+                  </pic:spPr>
+                </pic:pic>
+              </a:graphicData>
+            </a:graphic>
+          </wp:inline>
+        </w:drawing>
+      </w:r>
+    </w:p>
+    <w:p>
+      <w:pPr>
         <w:rPr>
           <w:rFonts w:ascii="Times New Roman" w:hAnsi="Times New Roman" w:cs="Times New Roman"/>
           <w:sz w:val="22"/>
@@ -362,6 +436,64 @@
     </w:p>
     <w:p>
       <w:pPr>
+        <w:pStyle w:val="NormalWeb"/>
+      </w:pPr>
+      <w:r>
+        <w:t>Total traffic volume by year (after removing duplicate-timestamp rows, explained below):</w:t>
+      </w:r>
+      <w:r>
+        <w:br/>
+        <w:t>2012: 6,785,754</w:t>
+      </w:r>
+      <w:r>
+        <w:br/>
+        <w:t>2013: 24,139,878</w:t>
+      </w:r>
+      <w:r>
+        <w:br/>
+        <w:t>2014: 14,718,915</w:t>
+      </w:r>
+      <w:r>
+        <w:br/>
+        <w:t>2015: 11,706,145</w:t>
+      </w:r>
+      <w:r>
+        <w:br/>
+        <w:t>2016: 25,032,183</w:t>
+      </w:r>
+      <w:r>
+        <w:br/>
+        <w:t>2017: 29,420,221</w:t>
+      </w:r>
+    </w:p>
+    <w:p>
+      <w:pPr>
+        <w:pStyle w:val="NormalWeb"/>
+      </w:pPr>
+      <w:r>
+        <w:rPr>
+          <w:b/>
+          <w:bCs/>
+        </w:rPr>
+        <w:lastRenderedPageBreak/>
+        <w:t>Note:</w:t>
+      </w:r>
+      <w:r>
+        <w:t xml:space="preserve"> I found that 5,445 timestamps in this dataset appear 2–3 times each, because the weather feed sometimes logs more than one observation within the same hour. I confirmed traffic_volume is identical across these duplicate rows, so I removed duplicates (keeping one row per unique hour, via the hourly_traffic view in 02_annual_trends.sql) before summing. Without this step, the totals above would be inflated.</w:t>
+      </w:r>
+    </w:p>
+    <w:p>
+      <w:pPr>
+        <w:rPr>
+          <w:rFonts w:ascii="Times New Roman" w:hAnsi="Times New Roman" w:cs="Times New Roman"/>
+          <w:sz w:val="22"/>
+          <w:szCs w:val="22"/>
+          <w:lang w:val="en-PH"/>
+        </w:rPr>
+      </w:pPr>
+    </w:p>
+    <w:p>
+      <w:pPr>
         <w:rPr>
           <w:rFonts w:ascii="Times New Roman" w:hAnsi="Times New Roman" w:cs="Times New Roman"/>
           <w:sz w:val="22"/>
@@ -405,6 +537,60 @@
     </w:p>
     <w:p>
       <w:pPr>
+        <w:rPr>
+          <w:rFonts w:ascii="Times New Roman" w:hAnsi="Times New Roman" w:cs="Times New Roman"/>
+          <w:sz w:val="22"/>
+          <w:szCs w:val="22"/>
+          <w:lang w:val="en-PH"/>
+        </w:rPr>
+      </w:pPr>
+      <w:r>
+        <w:rPr>
+          <w:rFonts w:ascii="Times New Roman" w:hAnsi="Times New Roman" w:cs="Times New Roman"/>
+          <w:sz w:val="22"/>
+          <w:szCs w:val="22"/>
+        </w:rPr>
+        <w:t>2013: increase vs. 2012</w:t>
+      </w:r>
+      <w:r>
+        <w:rPr>
+          <w:rFonts w:ascii="Times New Roman" w:hAnsi="Times New Roman" w:cs="Times New Roman"/>
+          <w:sz w:val="22"/>
+          <w:szCs w:val="22"/>
+        </w:rPr>
+        <w:br/>
+        <w:t>2014: decrease vs. 2013</w:t>
+      </w:r>
+      <w:r>
+        <w:rPr>
+          <w:rFonts w:ascii="Times New Roman" w:hAnsi="Times New Roman" w:cs="Times New Roman"/>
+          <w:sz w:val="22"/>
+          <w:szCs w:val="22"/>
+        </w:rPr>
+        <w:br/>
+        <w:t>2015: decrease vs. 2014</w:t>
+      </w:r>
+      <w:r>
+        <w:rPr>
+          <w:rFonts w:ascii="Times New Roman" w:hAnsi="Times New Roman" w:cs="Times New Roman"/>
+          <w:sz w:val="22"/>
+          <w:szCs w:val="22"/>
+        </w:rPr>
+        <w:br/>
+        <w:t>2016: increase vs. 2015</w:t>
+      </w:r>
+      <w:r>
+        <w:rPr>
+          <w:rFonts w:ascii="Times New Roman" w:hAnsi="Times New Roman" w:cs="Times New Roman"/>
+          <w:sz w:val="22"/>
+          <w:szCs w:val="22"/>
+        </w:rPr>
+        <w:br/>
+        <w:t>2017: increase vs. 2016</w:t>
+      </w:r>
+    </w:p>
+    <w:p>
+      <w:pPr>
         <w:pStyle w:val="ListParagraph"/>
         <w:numPr>
           <w:ilvl w:val="0"/>
@@ -429,6 +615,59 @@
     </w:p>
     <w:p>
       <w:pPr>
+        <w:rPr>
+          <w:rFonts w:ascii="Times New Roman" w:hAnsi="Times New Roman" w:cs="Times New Roman"/>
+          <w:sz w:val="22"/>
+          <w:szCs w:val="22"/>
+          <w:lang w:val="en-PH"/>
+        </w:rPr>
+      </w:pPr>
+      <w:r>
+        <w:rPr>
+          <w:rFonts w:ascii="Times New Roman" w:hAnsi="Times New Roman" w:cs="Times New Roman"/>
+          <w:sz w:val="22"/>
+          <w:szCs w:val="22"/>
+          <w:lang w:val="en-PH"/>
+        </w:rPr>
+        <w:drawing>
+          <wp:inline distT="0" distB="0" distL="0" distR="0" wp14:anchorId="2EC97331" wp14:editId="09B247EB">
+            <wp:extent cx="5731510" cy="941070"/>
+            <wp:effectExtent l="0" t="0" r="2540" b="0"/>
+            <wp:docPr id="487375621" name="Picture 1"/>
+            <wp:cNvGraphicFramePr>
+              <a:graphicFrameLocks xmlns:a="http://schemas.openxmlformats.org/drawingml/2006/main" noChangeAspect="1"/>
+            </wp:cNvGraphicFramePr>
+            <a:graphic xmlns:a="http://schemas.openxmlformats.org/drawingml/2006/main">
+              <a:graphicData uri="http://schemas.openxmlformats.org/drawingml/2006/picture">
+                <pic:pic xmlns:pic="http://schemas.openxmlformats.org/drawingml/2006/picture">
+                  <pic:nvPicPr>
+                    <pic:cNvPr id="487375621" name=""/>
+                    <pic:cNvPicPr/>
+                  </pic:nvPicPr>
+                  <pic:blipFill>
+                    <a:blip r:embed="rId6"/>
+                    <a:stretch>
+                      <a:fillRect/>
+                    </a:stretch>
+                  </pic:blipFill>
+                  <pic:spPr>
+                    <a:xfrm>
+                      <a:off x="0" y="0"/>
+                      <a:ext cx="5731510" cy="941070"/>
+                    </a:xfrm>
+                    <a:prstGeom prst="rect">
+                      <a:avLst/>
+                    </a:prstGeom>
+                  </pic:spPr>
+                </pic:pic>
+              </a:graphicData>
+            </a:graphic>
+          </wp:inline>
+        </w:drawing>
+      </w:r>
+    </w:p>
+    <w:p>
+      <w:pPr>
         <w:pStyle w:val="ListParagraph"/>
         <w:numPr>
           <w:ilvl w:val="0"/>
@@ -472,8 +711,177 @@
       </w:r>
     </w:p>
     <w:p>
-      <w:r>
-        <w:t>Task 1.1 and 1.2</w:t>
+      <w:pPr>
+        <w:pStyle w:val="ListParagraph"/>
+        <w:numPr>
+          <w:ilvl w:val="1"/>
+          <w:numId w:val="3"/>
+        </w:numPr>
+        <w:rPr>
+          <w:rFonts w:ascii="Times New Roman" w:hAnsi="Times New Roman" w:cs="Times New Roman"/>
+          <w:sz w:val="22"/>
+          <w:szCs w:val="22"/>
+          <w:lang w:val="en-PH"/>
+        </w:rPr>
+      </w:pPr>
+      <w:r>
+        <w:rPr>
+          <w:rFonts w:ascii="Times New Roman" w:hAnsi="Times New Roman" w:cs="Times New Roman"/>
+          <w:sz w:val="22"/>
+          <w:szCs w:val="22"/>
+        </w:rPr>
+        <w:t xml:space="preserve">The totals above are heavily shaped by how much data exists for each year, not just real traffic demand. The percentage of the year </w:t>
+      </w:r>
+      <w:r>
+        <w:rPr>
+          <w:rFonts w:ascii="Times New Roman" w:hAnsi="Times New Roman" w:cs="Times New Roman"/>
+          <w:sz w:val="22"/>
+          <w:szCs w:val="22"/>
+        </w:rPr>
+        <w:t xml:space="preserve">actually </w:t>
+      </w:r>
+      <w:r>
+        <w:rPr>
+          <w:rFonts w:ascii="Times New Roman" w:hAnsi="Times New Roman" w:cs="Times New Roman"/>
+          <w:sz w:val="22"/>
+          <w:szCs w:val="22"/>
+        </w:rPr>
+        <w:t>covered</w:t>
+      </w:r>
+      <w:r>
+        <w:rPr>
+          <w:rFonts w:ascii="Times New Roman" w:hAnsi="Times New Roman" w:cs="Times New Roman"/>
+          <w:sz w:val="22"/>
+          <w:szCs w:val="22"/>
+        </w:rPr>
+        <w:t xml:space="preserve"> by hourly records ranges from 23.9% (2012) to 99.5% (2017). This is why 2013 looks like a 255% jump over 2012</w:t>
+      </w:r>
+      <w:r>
+        <w:rPr>
+          <w:rFonts w:ascii="Times New Roman" w:hAnsi="Times New Roman" w:cs="Times New Roman"/>
+          <w:sz w:val="22"/>
+          <w:szCs w:val="22"/>
+        </w:rPr>
+        <w:t xml:space="preserve">, as </w:t>
+      </w:r>
+      <w:r>
+        <w:rPr>
+          <w:rFonts w:ascii="Times New Roman" w:hAnsi="Times New Roman" w:cs="Times New Roman"/>
+          <w:sz w:val="22"/>
+          <w:szCs w:val="22"/>
+        </w:rPr>
+        <w:t xml:space="preserve">the year 2012 </w:t>
+      </w:r>
+      <w:r>
+        <w:rPr>
+          <w:rFonts w:ascii="Times New Roman" w:hAnsi="Times New Roman" w:cs="Times New Roman"/>
+          <w:sz w:val="22"/>
+          <w:szCs w:val="22"/>
+        </w:rPr>
+        <w:t>only has data from October 2 onward (</w:t>
+      </w:r>
+      <w:r>
+        <w:rPr>
+          <w:rFonts w:ascii="Times New Roman" w:hAnsi="Times New Roman" w:cs="Times New Roman"/>
+          <w:sz w:val="22"/>
+          <w:szCs w:val="22"/>
+        </w:rPr>
+        <w:t>~ 2 mths</w:t>
+      </w:r>
+      <w:r>
+        <w:rPr>
+          <w:rFonts w:ascii="Times New Roman" w:hAnsi="Times New Roman" w:cs="Times New Roman"/>
+          <w:sz w:val="22"/>
+          <w:szCs w:val="22"/>
+        </w:rPr>
+        <w:t>)</w:t>
+      </w:r>
+      <w:r>
+        <w:rPr>
+          <w:rFonts w:ascii="Times New Roman" w:hAnsi="Times New Roman" w:cs="Times New Roman"/>
+          <w:sz w:val="22"/>
+          <w:szCs w:val="22"/>
+        </w:rPr>
+        <w:t xml:space="preserve">. Thus, </w:t>
+      </w:r>
+      <w:r>
+        <w:rPr>
+          <w:rFonts w:ascii="Times New Roman" w:hAnsi="Times New Roman" w:cs="Times New Roman"/>
+          <w:sz w:val="22"/>
+          <w:szCs w:val="22"/>
+        </w:rPr>
+        <w:t>not a genuine traffic surge.</w:t>
+      </w:r>
+    </w:p>
+    <w:p>
+      <w:pPr>
+        <w:pStyle w:val="ListParagraph"/>
+        <w:numPr>
+          <w:ilvl w:val="1"/>
+          <w:numId w:val="3"/>
+        </w:numPr>
+        <w:rPr>
+          <w:rFonts w:ascii="Times New Roman" w:hAnsi="Times New Roman" w:cs="Times New Roman"/>
+          <w:sz w:val="22"/>
+          <w:szCs w:val="22"/>
+          <w:lang w:val="en-PH"/>
+        </w:rPr>
+      </w:pPr>
+      <w:r>
+        <w:rPr>
+          <w:rFonts w:ascii="Times New Roman" w:hAnsi="Times New Roman" w:cs="Times New Roman"/>
+          <w:sz w:val="22"/>
+          <w:szCs w:val="22"/>
+        </w:rPr>
+        <w:t>A fairer comparison is average traffic volume per recorded hour, since it</w:t>
+      </w:r>
+      <w:r>
+        <w:rPr>
+          <w:rFonts w:ascii="Times New Roman" w:hAnsi="Times New Roman" w:cs="Times New Roman"/>
+          <w:sz w:val="22"/>
+          <w:szCs w:val="22"/>
+        </w:rPr>
+        <w:t>s agnostic to</w:t>
+      </w:r>
+      <w:r>
+        <w:rPr>
+          <w:rFonts w:ascii="Times New Roman" w:hAnsi="Times New Roman" w:cs="Times New Roman"/>
+          <w:sz w:val="22"/>
+          <w:szCs w:val="22"/>
+        </w:rPr>
+        <w:t xml:space="preserve"> how much data exists for each year. </w:t>
+      </w:r>
+      <w:r>
+        <w:rPr>
+          <w:rFonts w:ascii="Times New Roman" w:hAnsi="Times New Roman" w:cs="Times New Roman"/>
+          <w:sz w:val="22"/>
+          <w:szCs w:val="22"/>
+        </w:rPr>
+        <w:t>From that perspective,</w:t>
+      </w:r>
+      <w:r>
+        <w:rPr>
+          <w:rFonts w:ascii="Times New Roman" w:hAnsi="Times New Roman" w:cs="Times New Roman"/>
+          <w:sz w:val="22"/>
+          <w:szCs w:val="22"/>
+        </w:rPr>
+        <w:t xml:space="preserve"> 2012–2015 stayed in a narrow band (about 3,227 to 3,310 vehicles/hour). </w:t>
+      </w:r>
+      <w:r>
+        <w:rPr>
+          <w:rFonts w:ascii="Times New Roman" w:hAnsi="Times New Roman" w:cs="Times New Roman"/>
+          <w:sz w:val="22"/>
+          <w:szCs w:val="22"/>
+        </w:rPr>
+        <w:t xml:space="preserve">However, </w:t>
+      </w:r>
+      <w:r>
+        <w:rPr>
+          <w:rFonts w:ascii="Times New Roman" w:hAnsi="Times New Roman" w:cs="Times New Roman"/>
+          <w:sz w:val="22"/>
+          <w:szCs w:val="22"/>
+        </w:rPr>
+        <w:t>2016 was  the lowest of all six years (3,193.7/hour) despite having good coverage (89.2%). 2017 then reached the highest average of any year (3,376.6/hour, +5.73% over 2016), and since 2017 also has the most complete coverage (99.5%), this looks like a genuine increase in traffic demand rather than a data artifact.</w:t>
       </w:r>
     </w:p>
     <w:sectPr>
@@ -504,7 +912,7 @@
         <w:rFonts w:ascii="Symbol" w:hAnsi="Symbol" w:hint="default"/>
       </w:rPr>
     </w:lvl>
-    <w:lvl w:ilvl="1" w:tplc="34090003" w:tentative="1">
+    <w:lvl w:ilvl="1" w:tplc="34090003">
       <w:start w:val="1"/>
       <w:numFmt w:val="bullet"/>
       <w:lvlText w:val="o"/>
@@ -602,6 +1010,155 @@
     </w:lvl>
   </w:abstractNum>
   <w:abstractNum w:abstractNumId="1" w15:restartNumberingAfterBreak="0">
+    <w:nsid w:val="5CD93BD2"/>
+    <w:multiLevelType w:val="multilevel"/>
+    <w:tmpl w:val="62BAF922"/>
+    <w:lvl w:ilvl="0">
+      <w:start w:val="1"/>
+      <w:numFmt w:val="bullet"/>
+      <w:lvlText w:val=""/>
+      <w:lvlJc w:val="left"/>
+      <w:pPr>
+        <w:tabs>
+          <w:tab w:val="num" w:pos="720"/>
+        </w:tabs>
+        <w:ind w:left="720" w:hanging="360"/>
+      </w:pPr>
+      <w:rPr>
+        <w:rFonts w:ascii="Symbol" w:hAnsi="Symbol" w:hint="default"/>
+        <w:sz w:val="20"/>
+      </w:rPr>
+    </w:lvl>
+    <w:lvl w:ilvl="1" w:tentative="1">
+      <w:start w:val="1"/>
+      <w:numFmt w:val="bullet"/>
+      <w:lvlText w:val="o"/>
+      <w:lvlJc w:val="left"/>
+      <w:pPr>
+        <w:tabs>
+          <w:tab w:val="num" w:pos="1440"/>
+        </w:tabs>
+        <w:ind w:left="1440" w:hanging="360"/>
+      </w:pPr>
+      <w:rPr>
+        <w:rFonts w:ascii="Courier New" w:hAnsi="Courier New" w:hint="default"/>
+        <w:sz w:val="20"/>
+      </w:rPr>
+    </w:lvl>
+    <w:lvl w:ilvl="2" w:tentative="1">
+      <w:start w:val="1"/>
+      <w:numFmt w:val="bullet"/>
+      <w:lvlText w:val=""/>
+      <w:lvlJc w:val="left"/>
+      <w:pPr>
+        <w:tabs>
+          <w:tab w:val="num" w:pos="2160"/>
+        </w:tabs>
+        <w:ind w:left="2160" w:hanging="360"/>
+      </w:pPr>
+      <w:rPr>
+        <w:rFonts w:ascii="Wingdings" w:hAnsi="Wingdings" w:hint="default"/>
+        <w:sz w:val="20"/>
+      </w:rPr>
+    </w:lvl>
+    <w:lvl w:ilvl="3" w:tentative="1">
+      <w:start w:val="1"/>
+      <w:numFmt w:val="bullet"/>
+      <w:lvlText w:val=""/>
+      <w:lvlJc w:val="left"/>
+      <w:pPr>
+        <w:tabs>
+          <w:tab w:val="num" w:pos="2880"/>
+        </w:tabs>
+        <w:ind w:left="2880" w:hanging="360"/>
+      </w:pPr>
+      <w:rPr>
+        <w:rFonts w:ascii="Wingdings" w:hAnsi="Wingdings" w:hint="default"/>
+        <w:sz w:val="20"/>
+      </w:rPr>
+    </w:lvl>
+    <w:lvl w:ilvl="4" w:tentative="1">
+      <w:start w:val="1"/>
+      <w:numFmt w:val="bullet"/>
+      <w:lvlText w:val=""/>
+      <w:lvlJc w:val="left"/>
+      <w:pPr>
+        <w:tabs>
+          <w:tab w:val="num" w:pos="3600"/>
+        </w:tabs>
+        <w:ind w:left="3600" w:hanging="360"/>
+      </w:pPr>
+      <w:rPr>
+        <w:rFonts w:ascii="Wingdings" w:hAnsi="Wingdings" w:hint="default"/>
+        <w:sz w:val="20"/>
+      </w:rPr>
+    </w:lvl>
+    <w:lvl w:ilvl="5" w:tentative="1">
+      <w:start w:val="1"/>
+      <w:numFmt w:val="bullet"/>
+      <w:lvlText w:val=""/>
+      <w:lvlJc w:val="left"/>
+      <w:pPr>
+        <w:tabs>
+          <w:tab w:val="num" w:pos="4320"/>
+        </w:tabs>
+        <w:ind w:left="4320" w:hanging="360"/>
+      </w:pPr>
+      <w:rPr>
+        <w:rFonts w:ascii="Wingdings" w:hAnsi="Wingdings" w:hint="default"/>
+        <w:sz w:val="20"/>
+      </w:rPr>
+    </w:lvl>
+    <w:lvl w:ilvl="6" w:tentative="1">
+      <w:start w:val="1"/>
+      <w:numFmt w:val="bullet"/>
+      <w:lvlText w:val=""/>
+      <w:lvlJc w:val="left"/>
+      <w:pPr>
+        <w:tabs>
+          <w:tab w:val="num" w:pos="5040"/>
+        </w:tabs>
+        <w:ind w:left="5040" w:hanging="360"/>
+      </w:pPr>
+      <w:rPr>
+        <w:rFonts w:ascii="Wingdings" w:hAnsi="Wingdings" w:hint="default"/>
+        <w:sz w:val="20"/>
+      </w:rPr>
+    </w:lvl>
+    <w:lvl w:ilvl="7" w:tentative="1">
+      <w:start w:val="1"/>
+      <w:numFmt w:val="bullet"/>
+      <w:lvlText w:val=""/>
+      <w:lvlJc w:val="left"/>
+      <w:pPr>
+        <w:tabs>
+          <w:tab w:val="num" w:pos="5760"/>
+        </w:tabs>
+        <w:ind w:left="5760" w:hanging="360"/>
+      </w:pPr>
+      <w:rPr>
+        <w:rFonts w:ascii="Wingdings" w:hAnsi="Wingdings" w:hint="default"/>
+        <w:sz w:val="20"/>
+      </w:rPr>
+    </w:lvl>
+    <w:lvl w:ilvl="8" w:tentative="1">
+      <w:start w:val="1"/>
+      <w:numFmt w:val="bullet"/>
+      <w:lvlText w:val=""/>
+      <w:lvlJc w:val="left"/>
+      <w:pPr>
+        <w:tabs>
+          <w:tab w:val="num" w:pos="6480"/>
+        </w:tabs>
+        <w:ind w:left="6480" w:hanging="360"/>
+      </w:pPr>
+      <w:rPr>
+        <w:rFonts w:ascii="Wingdings" w:hAnsi="Wingdings" w:hint="default"/>
+        <w:sz w:val="20"/>
+      </w:rPr>
+    </w:lvl>
+  </w:abstractNum>
+  <w:abstractNum w:abstractNumId="2" w15:restartNumberingAfterBreak="0">
     <w:nsid w:val="740F428C"/>
     <w:multiLevelType w:val="hybridMultilevel"/>
     <w:tmpl w:val="81E6BFDE"/>
@@ -714,7 +1271,7 @@
       </w:rPr>
     </w:lvl>
   </w:abstractNum>
-  <w:abstractNum w:abstractNumId="2" w15:restartNumberingAfterBreak="0">
+  <w:abstractNum w:abstractNumId="3" w15:restartNumberingAfterBreak="0">
     <w:nsid w:val="7EE455F6"/>
     <w:multiLevelType w:val="hybridMultilevel"/>
     <w:tmpl w:val="17600EDA"/>
@@ -828,13 +1385,16 @@
     </w:lvl>
   </w:abstractNum>
   <w:num w:numId="1" w16cid:durableId="1743143035">
-    <w:abstractNumId w:val="2"/>
+    <w:abstractNumId w:val="3"/>
   </w:num>
   <w:num w:numId="2" w16cid:durableId="1082602018">
-    <w:abstractNumId w:val="1"/>
+    <w:abstractNumId w:val="2"/>
   </w:num>
   <w:num w:numId="3" w16cid:durableId="1385986353">
     <w:abstractNumId w:val="0"/>
+  </w:num>
+  <w:num w:numId="4" w16cid:durableId="411506492">
+    <w:abstractNumId w:val="1"/>
   </w:num>
 </w:numbering>
 </file>
@@ -1451,7 +2011,6 @@
   <w:style w:type="character" w:default="1" w:styleId="DefaultParagraphFont">
     <w:name w:val="Default Paragraph Font"/>
     <w:uiPriority w:val="1"/>
-    <w:semiHidden/>
     <w:unhideWhenUsed/>
   </w:style>
   <w:style w:type="table" w:default="1" w:styleId="TableNormal">
@@ -1763,6 +2322,23 @@
       <w:smallCaps/>
       <w:color w:val="2F5496" w:themeColor="accent1" w:themeShade="BF"/>
       <w:spacing w:val="5"/>
+    </w:rPr>
+  </w:style>
+  <w:style w:type="paragraph" w:styleId="NormalWeb">
+    <w:name w:val="Normal (Web)"/>
+    <w:basedOn w:val="Normal"/>
+    <w:uiPriority w:val="99"/>
+    <w:semiHidden/>
+    <w:unhideWhenUsed/>
+    <w:rsid w:val="00643F0E"/>
+    <w:pPr>
+      <w:spacing w:before="100" w:beforeAutospacing="1" w:after="100" w:afterAutospacing="1" w:line="240" w:lineRule="auto"/>
+    </w:pPr>
+    <w:rPr>
+      <w:rFonts w:ascii="Times New Roman" w:eastAsia="Times New Roman" w:hAnsi="Times New Roman" w:cs="Times New Roman"/>
+      <w:kern w:val="0"/>
+      <w:lang w:val="en-SG" w:eastAsia="en-SG"/>
+      <w14:ligatures w14:val="none"/>
     </w:rPr>
   </w:style>
 </w:styles>

</xml_diff>

<commit_message>
Add Task 1.3: holiday temperature analysis
  Add Task 1.3: holiday temperature analysis
</commit_message>
<xml_diff>
--- a/part1_data_analytics/sql_analysis_notes.docx
+++ b/part1_data_analytics/sql_analysis_notes.docx
@@ -881,7 +881,2618 @@
           <w:sz w:val="22"/>
           <w:szCs w:val="22"/>
         </w:rPr>
-        <w:t>2016 was  the lowest of all six years (3,193.7/hour) despite having good coverage (89.2%). 2017 then reached the highest average of any year (3,376.6/hour, +5.73% over 2016), and since 2017 also has the most complete coverage (99.5%), this looks like a genuine increase in traffic demand rather than a data artifact.</w:t>
+        <w:t xml:space="preserve">2016 </w:t>
+      </w:r>
+      <w:r>
+        <w:rPr>
+          <w:rFonts w:ascii="Times New Roman" w:hAnsi="Times New Roman" w:cs="Times New Roman"/>
+          <w:sz w:val="22"/>
+          <w:szCs w:val="22"/>
+        </w:rPr>
+        <w:t>was the</w:t>
+      </w:r>
+      <w:r>
+        <w:rPr>
+          <w:rFonts w:ascii="Times New Roman" w:hAnsi="Times New Roman" w:cs="Times New Roman"/>
+          <w:sz w:val="22"/>
+          <w:szCs w:val="22"/>
+        </w:rPr>
+        <w:t xml:space="preserve"> lowest of all six years (3,193.7/hour) despite having good coverage (89.2%). 2017 then reached the highest average of any year (3,376.6/hour, +5.73% over 2016), and since 2017 also has the most complete coverage (99.5%), this looks like a genuine increase in traffic demand rather than a data artifact.</w:t>
+      </w:r>
+    </w:p>
+    <w:p>
+      <w:pPr>
+        <w:rPr>
+          <w:rFonts w:ascii="Times New Roman" w:hAnsi="Times New Roman" w:cs="Times New Roman"/>
+          <w:sz w:val="22"/>
+          <w:szCs w:val="22"/>
+          <w:lang w:val="en-PH"/>
+        </w:rPr>
+      </w:pPr>
+      <w:r>
+        <w:rPr>
+          <w:rFonts w:ascii="Times New Roman" w:hAnsi="Times New Roman" w:cs="Times New Roman"/>
+          <w:b/>
+          <w:bCs/>
+          <w:sz w:val="22"/>
+          <w:szCs w:val="22"/>
+          <w:lang w:val="en-PH"/>
+        </w:rPr>
+        <w:t>1.3 Analyse temperature around holidays</w:t>
+      </w:r>
+    </w:p>
+    <w:p>
+      <w:pPr>
+        <w:rPr>
+          <w:rFonts w:ascii="Times New Roman" w:hAnsi="Times New Roman" w:cs="Times New Roman"/>
+          <w:sz w:val="22"/>
+          <w:szCs w:val="22"/>
+          <w:lang w:val="en-PH"/>
+        </w:rPr>
+      </w:pPr>
+      <w:r>
+        <w:rPr>
+          <w:rFonts w:ascii="Times New Roman" w:hAnsi="Times New Roman" w:cs="Times New Roman"/>
+          <w:sz w:val="22"/>
+          <w:szCs w:val="22"/>
+          <w:lang w:val="en-PH"/>
+        </w:rPr>
+        <w:t xml:space="preserve">Compare temperature patterns for </w:t>
+      </w:r>
+      <w:r>
+        <w:rPr>
+          <w:rFonts w:ascii="Times New Roman" w:hAnsi="Times New Roman" w:cs="Times New Roman"/>
+          <w:b/>
+          <w:bCs/>
+          <w:sz w:val="22"/>
+          <w:szCs w:val="22"/>
+          <w:lang w:val="en-PH"/>
+        </w:rPr>
+        <w:t>2015, 2016 and 2017</w:t>
+      </w:r>
+      <w:r>
+        <w:rPr>
+          <w:rFonts w:ascii="Times New Roman" w:hAnsi="Times New Roman" w:cs="Times New Roman"/>
+          <w:sz w:val="22"/>
+          <w:szCs w:val="22"/>
+          <w:lang w:val="en-PH"/>
+        </w:rPr>
+        <w:t xml:space="preserve"> during:</w:t>
+      </w:r>
+    </w:p>
+    <w:p>
+      <w:pPr>
+        <w:pStyle w:val="ListParagraph"/>
+        <w:numPr>
+          <w:ilvl w:val="0"/>
+          <w:numId w:val="5"/>
+        </w:numPr>
+        <w:rPr>
+          <w:rFonts w:ascii="Times New Roman" w:hAnsi="Times New Roman" w:cs="Times New Roman"/>
+          <w:sz w:val="22"/>
+          <w:szCs w:val="22"/>
+          <w:lang w:val="en-PH"/>
+        </w:rPr>
+      </w:pPr>
+      <w:r>
+        <w:rPr>
+          <w:rFonts w:ascii="Times New Roman" w:hAnsi="Times New Roman" w:cs="Times New Roman"/>
+          <w:sz w:val="22"/>
+          <w:szCs w:val="22"/>
+          <w:lang w:val="en-PH"/>
+        </w:rPr>
+        <w:t xml:space="preserve">New Year's Day </w:t>
+      </w:r>
+    </w:p>
+    <w:p>
+      <w:pPr>
+        <w:pStyle w:val="ListParagraph"/>
+        <w:numPr>
+          <w:ilvl w:val="0"/>
+          <w:numId w:val="5"/>
+        </w:numPr>
+        <w:rPr>
+          <w:rFonts w:ascii="Times New Roman" w:hAnsi="Times New Roman" w:cs="Times New Roman"/>
+          <w:sz w:val="22"/>
+          <w:szCs w:val="22"/>
+          <w:lang w:val="en-PH"/>
+        </w:rPr>
+      </w:pPr>
+      <w:r>
+        <w:rPr>
+          <w:rFonts w:ascii="Times New Roman" w:hAnsi="Times New Roman" w:cs="Times New Roman"/>
+          <w:sz w:val="22"/>
+          <w:szCs w:val="22"/>
+          <w:lang w:val="en-PH"/>
+        </w:rPr>
+        <w:t xml:space="preserve">Labor Day </w:t>
+      </w:r>
+    </w:p>
+    <w:p>
+      <w:pPr>
+        <w:rPr>
+          <w:rFonts w:ascii="Times New Roman" w:hAnsi="Times New Roman" w:cs="Times New Roman"/>
+          <w:sz w:val="22"/>
+          <w:szCs w:val="22"/>
+        </w:rPr>
+      </w:pPr>
+    </w:p>
+    <w:p>
+      <w:pPr>
+        <w:rPr>
+          <w:rFonts w:ascii="Times New Roman" w:hAnsi="Times New Roman" w:cs="Times New Roman"/>
+          <w:sz w:val="22"/>
+          <w:szCs w:val="22"/>
+        </w:rPr>
+      </w:pPr>
+    </w:p>
+    <w:tbl>
+      <w:tblPr>
+        <w:tblW w:w="9360" w:type="dxa"/>
+        <w:tblLook w:val="04A0" w:firstRow="1" w:lastRow="0" w:firstColumn="1" w:lastColumn="0" w:noHBand="0" w:noVBand="1"/>
+      </w:tblPr>
+      <w:tblGrid>
+        <w:gridCol w:w="1760"/>
+        <w:gridCol w:w="880"/>
+        <w:gridCol w:w="1540"/>
+        <w:gridCol w:w="1540"/>
+        <w:gridCol w:w="1660"/>
+        <w:gridCol w:w="1980"/>
+      </w:tblGrid>
+      <w:tr>
+        <w:trPr>
+          <w:trHeight w:val="290"/>
+        </w:trPr>
+        <w:tc>
+          <w:tcPr>
+            <w:tcW w:w="1760" w:type="dxa"/>
+            <w:tcBorders>
+              <w:top w:val="single" w:sz="4" w:space="0" w:color="B7B7B7"/>
+              <w:left w:val="single" w:sz="4" w:space="0" w:color="B7B7B7"/>
+              <w:bottom w:val="single" w:sz="4" w:space="0" w:color="B7B7B7"/>
+              <w:right w:val="single" w:sz="4" w:space="0" w:color="B7B7B7"/>
+            </w:tcBorders>
+            <w:shd w:val="clear" w:color="4472C4" w:fill="4472C4"/>
+            <w:noWrap/>
+            <w:vAlign w:val="bottom"/>
+            <w:hideMark/>
+          </w:tcPr>
+          <w:p>
+            <w:pPr>
+              <w:spacing w:after="0" w:line="240" w:lineRule="auto"/>
+              <w:jc w:val="center"/>
+              <w:rPr>
+                <w:rFonts w:ascii="Arial" w:eastAsia="Times New Roman" w:hAnsi="Arial" w:cs="Arial"/>
+                <w:b/>
+                <w:bCs/>
+                <w:color w:val="FFFFFF"/>
+                <w:kern w:val="0"/>
+                <w:sz w:val="22"/>
+                <w:szCs w:val="22"/>
+                <w:lang w:val="en-SG" w:eastAsia="en-SG"/>
+                <w14:ligatures w14:val="none"/>
+              </w:rPr>
+            </w:pPr>
+            <w:r>
+              <w:rPr>
+                <w:rFonts w:ascii="Arial" w:eastAsia="Times New Roman" w:hAnsi="Arial" w:cs="Arial"/>
+                <w:b/>
+                <w:bCs/>
+                <w:color w:val="FFFFFF"/>
+                <w:kern w:val="0"/>
+                <w:sz w:val="22"/>
+                <w:szCs w:val="22"/>
+                <w:lang w:val="en-SG" w:eastAsia="en-SG"/>
+                <w14:ligatures w14:val="none"/>
+              </w:rPr>
+              <w:lastRenderedPageBreak/>
+              <w:t>Holiday</w:t>
+            </w:r>
+          </w:p>
+        </w:tc>
+        <w:tc>
+          <w:tcPr>
+            <w:tcW w:w="880" w:type="dxa"/>
+            <w:tcBorders>
+              <w:top w:val="single" w:sz="4" w:space="0" w:color="B7B7B7"/>
+              <w:left w:val="nil"/>
+              <w:bottom w:val="single" w:sz="4" w:space="0" w:color="B7B7B7"/>
+              <w:right w:val="single" w:sz="4" w:space="0" w:color="B7B7B7"/>
+            </w:tcBorders>
+            <w:shd w:val="clear" w:color="4472C4" w:fill="4472C4"/>
+            <w:noWrap/>
+            <w:vAlign w:val="bottom"/>
+            <w:hideMark/>
+          </w:tcPr>
+          <w:p>
+            <w:pPr>
+              <w:spacing w:after="0" w:line="240" w:lineRule="auto"/>
+              <w:jc w:val="center"/>
+              <w:rPr>
+                <w:rFonts w:ascii="Arial" w:eastAsia="Times New Roman" w:hAnsi="Arial" w:cs="Arial"/>
+                <w:b/>
+                <w:bCs/>
+                <w:color w:val="FFFFFF"/>
+                <w:kern w:val="0"/>
+                <w:sz w:val="22"/>
+                <w:szCs w:val="22"/>
+                <w:lang w:val="en-SG" w:eastAsia="en-SG"/>
+                <w14:ligatures w14:val="none"/>
+              </w:rPr>
+            </w:pPr>
+            <w:r>
+              <w:rPr>
+                <w:rFonts w:ascii="Arial" w:eastAsia="Times New Roman" w:hAnsi="Arial" w:cs="Arial"/>
+                <w:b/>
+                <w:bCs/>
+                <w:color w:val="FFFFFF"/>
+                <w:kern w:val="0"/>
+                <w:sz w:val="22"/>
+                <w:szCs w:val="22"/>
+                <w:lang w:val="en-SG" w:eastAsia="en-SG"/>
+                <w14:ligatures w14:val="none"/>
+              </w:rPr>
+              <w:t>Year</w:t>
+            </w:r>
+          </w:p>
+        </w:tc>
+        <w:tc>
+          <w:tcPr>
+            <w:tcW w:w="1540" w:type="dxa"/>
+            <w:tcBorders>
+              <w:top w:val="single" w:sz="4" w:space="0" w:color="B7B7B7"/>
+              <w:left w:val="nil"/>
+              <w:bottom w:val="single" w:sz="4" w:space="0" w:color="B7B7B7"/>
+              <w:right w:val="single" w:sz="4" w:space="0" w:color="B7B7B7"/>
+            </w:tcBorders>
+            <w:shd w:val="clear" w:color="4472C4" w:fill="4472C4"/>
+            <w:noWrap/>
+            <w:vAlign w:val="bottom"/>
+            <w:hideMark/>
+          </w:tcPr>
+          <w:p>
+            <w:pPr>
+              <w:spacing w:after="0" w:line="240" w:lineRule="auto"/>
+              <w:jc w:val="center"/>
+              <w:rPr>
+                <w:rFonts w:ascii="Arial" w:eastAsia="Times New Roman" w:hAnsi="Arial" w:cs="Arial"/>
+                <w:b/>
+                <w:bCs/>
+                <w:color w:val="FFFFFF"/>
+                <w:kern w:val="0"/>
+                <w:sz w:val="22"/>
+                <w:szCs w:val="22"/>
+                <w:lang w:val="en-SG" w:eastAsia="en-SG"/>
+                <w14:ligatures w14:val="none"/>
+              </w:rPr>
+            </w:pPr>
+            <w:r>
+              <w:rPr>
+                <w:rFonts w:ascii="Arial" w:eastAsia="Times New Roman" w:hAnsi="Arial" w:cs="Arial"/>
+                <w:b/>
+                <w:bCs/>
+                <w:color w:val="FFFFFF"/>
+                <w:kern w:val="0"/>
+                <w:sz w:val="22"/>
+                <w:szCs w:val="22"/>
+                <w:lang w:val="en-SG" w:eastAsia="en-SG"/>
+                <w14:ligatures w14:val="none"/>
+              </w:rPr>
+              <w:t>Avg Temp (°C)</w:t>
+            </w:r>
+          </w:p>
+        </w:tc>
+        <w:tc>
+          <w:tcPr>
+            <w:tcW w:w="1540" w:type="dxa"/>
+            <w:tcBorders>
+              <w:top w:val="single" w:sz="4" w:space="0" w:color="B7B7B7"/>
+              <w:left w:val="nil"/>
+              <w:bottom w:val="single" w:sz="4" w:space="0" w:color="B7B7B7"/>
+              <w:right w:val="single" w:sz="4" w:space="0" w:color="B7B7B7"/>
+            </w:tcBorders>
+            <w:shd w:val="clear" w:color="4472C4" w:fill="4472C4"/>
+            <w:noWrap/>
+            <w:vAlign w:val="bottom"/>
+            <w:hideMark/>
+          </w:tcPr>
+          <w:p>
+            <w:pPr>
+              <w:spacing w:after="0" w:line="240" w:lineRule="auto"/>
+              <w:jc w:val="center"/>
+              <w:rPr>
+                <w:rFonts w:ascii="Arial" w:eastAsia="Times New Roman" w:hAnsi="Arial" w:cs="Arial"/>
+                <w:b/>
+                <w:bCs/>
+                <w:color w:val="FFFFFF"/>
+                <w:kern w:val="0"/>
+                <w:sz w:val="22"/>
+                <w:szCs w:val="22"/>
+                <w:lang w:val="en-SG" w:eastAsia="en-SG"/>
+                <w14:ligatures w14:val="none"/>
+              </w:rPr>
+            </w:pPr>
+            <w:r>
+              <w:rPr>
+                <w:rFonts w:ascii="Arial" w:eastAsia="Times New Roman" w:hAnsi="Arial" w:cs="Arial"/>
+                <w:b/>
+                <w:bCs/>
+                <w:color w:val="FFFFFF"/>
+                <w:kern w:val="0"/>
+                <w:sz w:val="22"/>
+                <w:szCs w:val="22"/>
+                <w:lang w:val="en-SG" w:eastAsia="en-SG"/>
+                <w14:ligatures w14:val="none"/>
+              </w:rPr>
+              <w:t>Avg Temp (K)</w:t>
+            </w:r>
+          </w:p>
+        </w:tc>
+        <w:tc>
+          <w:tcPr>
+            <w:tcW w:w="1660" w:type="dxa"/>
+            <w:tcBorders>
+              <w:top w:val="single" w:sz="4" w:space="0" w:color="B7B7B7"/>
+              <w:left w:val="nil"/>
+              <w:bottom w:val="single" w:sz="4" w:space="0" w:color="B7B7B7"/>
+              <w:right w:val="single" w:sz="4" w:space="0" w:color="B7B7B7"/>
+            </w:tcBorders>
+            <w:shd w:val="clear" w:color="4472C4" w:fill="4472C4"/>
+            <w:noWrap/>
+            <w:vAlign w:val="bottom"/>
+            <w:hideMark/>
+          </w:tcPr>
+          <w:p>
+            <w:pPr>
+              <w:spacing w:after="0" w:line="240" w:lineRule="auto"/>
+              <w:jc w:val="center"/>
+              <w:rPr>
+                <w:rFonts w:ascii="Arial" w:eastAsia="Times New Roman" w:hAnsi="Arial" w:cs="Arial"/>
+                <w:b/>
+                <w:bCs/>
+                <w:color w:val="FFFFFF"/>
+                <w:kern w:val="0"/>
+                <w:sz w:val="22"/>
+                <w:szCs w:val="22"/>
+                <w:lang w:val="en-SG" w:eastAsia="en-SG"/>
+                <w14:ligatures w14:val="none"/>
+              </w:rPr>
+            </w:pPr>
+            <w:r>
+              <w:rPr>
+                <w:rFonts w:ascii="Arial" w:eastAsia="Times New Roman" w:hAnsi="Arial" w:cs="Arial"/>
+                <w:b/>
+                <w:bCs/>
+                <w:color w:val="FFFFFF"/>
+                <w:kern w:val="0"/>
+                <w:sz w:val="22"/>
+                <w:szCs w:val="22"/>
+                <w:lang w:val="en-SG" w:eastAsia="en-SG"/>
+                <w14:ligatures w14:val="none"/>
+              </w:rPr>
+              <w:t>Hours Recorded</w:t>
+            </w:r>
+          </w:p>
+        </w:tc>
+        <w:tc>
+          <w:tcPr>
+            <w:tcW w:w="1980" w:type="dxa"/>
+            <w:tcBorders>
+              <w:top w:val="single" w:sz="4" w:space="0" w:color="B7B7B7"/>
+              <w:left w:val="nil"/>
+              <w:bottom w:val="single" w:sz="4" w:space="0" w:color="B7B7B7"/>
+              <w:right w:val="single" w:sz="4" w:space="0" w:color="B7B7B7"/>
+            </w:tcBorders>
+            <w:shd w:val="clear" w:color="4472C4" w:fill="4472C4"/>
+            <w:noWrap/>
+            <w:vAlign w:val="bottom"/>
+            <w:hideMark/>
+          </w:tcPr>
+          <w:p>
+            <w:pPr>
+              <w:spacing w:after="0" w:line="240" w:lineRule="auto"/>
+              <w:jc w:val="center"/>
+              <w:rPr>
+                <w:rFonts w:ascii="Arial" w:eastAsia="Times New Roman" w:hAnsi="Arial" w:cs="Arial"/>
+                <w:b/>
+                <w:bCs/>
+                <w:color w:val="FFFFFF"/>
+                <w:kern w:val="0"/>
+                <w:sz w:val="22"/>
+                <w:szCs w:val="22"/>
+                <w:lang w:val="en-SG" w:eastAsia="en-SG"/>
+                <w14:ligatures w14:val="none"/>
+              </w:rPr>
+            </w:pPr>
+            <w:r>
+              <w:rPr>
+                <w:rFonts w:ascii="Arial" w:eastAsia="Times New Roman" w:hAnsi="Arial" w:cs="Arial"/>
+                <w:b/>
+                <w:bCs/>
+                <w:color w:val="FFFFFF"/>
+                <w:kern w:val="0"/>
+                <w:sz w:val="22"/>
+                <w:szCs w:val="22"/>
+                <w:lang w:val="en-SG" w:eastAsia="en-SG"/>
+                <w14:ligatures w14:val="none"/>
+              </w:rPr>
+              <w:t>Avg Traffic Volume</w:t>
+            </w:r>
+          </w:p>
+        </w:tc>
+      </w:tr>
+      <w:tr>
+        <w:trPr>
+          <w:trHeight w:val="290"/>
+        </w:trPr>
+        <w:tc>
+          <w:tcPr>
+            <w:tcW w:w="1760" w:type="dxa"/>
+            <w:tcBorders>
+              <w:top w:val="nil"/>
+              <w:left w:val="single" w:sz="4" w:space="0" w:color="B7B7B7"/>
+              <w:bottom w:val="single" w:sz="4" w:space="0" w:color="B7B7B7"/>
+              <w:right w:val="single" w:sz="4" w:space="0" w:color="B7B7B7"/>
+            </w:tcBorders>
+            <w:noWrap/>
+            <w:vAlign w:val="bottom"/>
+            <w:hideMark/>
+          </w:tcPr>
+          <w:p>
+            <w:pPr>
+              <w:spacing w:after="0" w:line="240" w:lineRule="auto"/>
+              <w:jc w:val="center"/>
+              <w:rPr>
+                <w:rFonts w:ascii="Arial" w:eastAsia="Times New Roman" w:hAnsi="Arial" w:cs="Arial"/>
+                <w:kern w:val="0"/>
+                <w:sz w:val="22"/>
+                <w:szCs w:val="22"/>
+                <w:lang w:val="en-SG" w:eastAsia="en-SG"/>
+                <w14:ligatures w14:val="none"/>
+              </w:rPr>
+            </w:pPr>
+            <w:r>
+              <w:rPr>
+                <w:rFonts w:ascii="Arial" w:eastAsia="Times New Roman" w:hAnsi="Arial" w:cs="Arial"/>
+                <w:kern w:val="0"/>
+                <w:sz w:val="22"/>
+                <w:szCs w:val="22"/>
+                <w:lang w:val="en-SG" w:eastAsia="en-SG"/>
+                <w14:ligatures w14:val="none"/>
+              </w:rPr>
+              <w:t>New Year's Day</w:t>
+            </w:r>
+          </w:p>
+        </w:tc>
+        <w:tc>
+          <w:tcPr>
+            <w:tcW w:w="880" w:type="dxa"/>
+            <w:tcBorders>
+              <w:top w:val="nil"/>
+              <w:left w:val="nil"/>
+              <w:bottom w:val="single" w:sz="4" w:space="0" w:color="B7B7B7"/>
+              <w:right w:val="single" w:sz="4" w:space="0" w:color="B7B7B7"/>
+            </w:tcBorders>
+            <w:noWrap/>
+            <w:vAlign w:val="bottom"/>
+            <w:hideMark/>
+          </w:tcPr>
+          <w:p>
+            <w:pPr>
+              <w:spacing w:after="0" w:line="240" w:lineRule="auto"/>
+              <w:jc w:val="center"/>
+              <w:rPr>
+                <w:rFonts w:ascii="Arial" w:eastAsia="Times New Roman" w:hAnsi="Arial" w:cs="Arial"/>
+                <w:kern w:val="0"/>
+                <w:sz w:val="22"/>
+                <w:szCs w:val="22"/>
+                <w:lang w:val="en-SG" w:eastAsia="en-SG"/>
+                <w14:ligatures w14:val="none"/>
+              </w:rPr>
+            </w:pPr>
+            <w:r>
+              <w:rPr>
+                <w:rFonts w:ascii="Arial" w:eastAsia="Times New Roman" w:hAnsi="Arial" w:cs="Arial"/>
+                <w:kern w:val="0"/>
+                <w:sz w:val="22"/>
+                <w:szCs w:val="22"/>
+                <w:lang w:val="en-SG" w:eastAsia="en-SG"/>
+                <w14:ligatures w14:val="none"/>
+              </w:rPr>
+              <w:t>2015</w:t>
+            </w:r>
+          </w:p>
+        </w:tc>
+        <w:tc>
+          <w:tcPr>
+            <w:tcW w:w="1540" w:type="dxa"/>
+            <w:tcBorders>
+              <w:top w:val="nil"/>
+              <w:left w:val="nil"/>
+              <w:bottom w:val="single" w:sz="4" w:space="0" w:color="B7B7B7"/>
+              <w:right w:val="single" w:sz="4" w:space="0" w:color="B7B7B7"/>
+            </w:tcBorders>
+            <w:noWrap/>
+            <w:vAlign w:val="bottom"/>
+            <w:hideMark/>
+          </w:tcPr>
+          <w:p>
+            <w:pPr>
+              <w:spacing w:after="0" w:line="240" w:lineRule="auto"/>
+              <w:jc w:val="center"/>
+              <w:rPr>
+                <w:rFonts w:ascii="Arial" w:eastAsia="Times New Roman" w:hAnsi="Arial" w:cs="Arial"/>
+                <w:kern w:val="0"/>
+                <w:sz w:val="22"/>
+                <w:szCs w:val="22"/>
+                <w:lang w:val="en-SG" w:eastAsia="en-SG"/>
+                <w14:ligatures w14:val="none"/>
+              </w:rPr>
+            </w:pPr>
+            <w:r>
+              <w:rPr>
+                <w:rFonts w:ascii="Arial" w:eastAsia="Times New Roman" w:hAnsi="Arial" w:cs="Arial"/>
+                <w:kern w:val="0"/>
+                <w:sz w:val="22"/>
+                <w:szCs w:val="22"/>
+                <w:lang w:val="en-SG" w:eastAsia="en-SG"/>
+                <w14:ligatures w14:val="none"/>
+              </w:rPr>
+              <w:t>No data</w:t>
+            </w:r>
+            <w:r>
+              <w:rPr>
+                <w:rFonts w:ascii="Arial" w:eastAsia="Times New Roman" w:hAnsi="Arial" w:cs="Arial"/>
+                <w:kern w:val="0"/>
+                <w:sz w:val="22"/>
+                <w:szCs w:val="22"/>
+                <w:lang w:val="en-SG" w:eastAsia="en-SG"/>
+                <w14:ligatures w14:val="none"/>
+              </w:rPr>
+              <w:t>*</w:t>
+            </w:r>
+          </w:p>
+        </w:tc>
+        <w:tc>
+          <w:tcPr>
+            <w:tcW w:w="1540" w:type="dxa"/>
+            <w:tcBorders>
+              <w:top w:val="nil"/>
+              <w:left w:val="nil"/>
+              <w:bottom w:val="single" w:sz="4" w:space="0" w:color="B7B7B7"/>
+              <w:right w:val="single" w:sz="4" w:space="0" w:color="B7B7B7"/>
+            </w:tcBorders>
+            <w:noWrap/>
+            <w:vAlign w:val="bottom"/>
+            <w:hideMark/>
+          </w:tcPr>
+          <w:p>
+            <w:pPr>
+              <w:spacing w:after="0" w:line="240" w:lineRule="auto"/>
+              <w:jc w:val="center"/>
+              <w:rPr>
+                <w:rFonts w:ascii="Arial" w:eastAsia="Times New Roman" w:hAnsi="Arial" w:cs="Arial"/>
+                <w:kern w:val="0"/>
+                <w:sz w:val="22"/>
+                <w:szCs w:val="22"/>
+                <w:lang w:val="en-SG" w:eastAsia="en-SG"/>
+                <w14:ligatures w14:val="none"/>
+              </w:rPr>
+            </w:pPr>
+            <w:r>
+              <w:rPr>
+                <w:rFonts w:ascii="Arial" w:eastAsia="Times New Roman" w:hAnsi="Arial" w:cs="Arial"/>
+                <w:kern w:val="0"/>
+                <w:sz w:val="22"/>
+                <w:szCs w:val="22"/>
+                <w:lang w:val="en-SG" w:eastAsia="en-SG"/>
+                <w14:ligatures w14:val="none"/>
+              </w:rPr>
+              <w:t>No data</w:t>
+            </w:r>
+            <w:r>
+              <w:rPr>
+                <w:rFonts w:ascii="Arial" w:eastAsia="Times New Roman" w:hAnsi="Arial" w:cs="Arial"/>
+                <w:kern w:val="0"/>
+                <w:sz w:val="22"/>
+                <w:szCs w:val="22"/>
+                <w:lang w:val="en-SG" w:eastAsia="en-SG"/>
+                <w14:ligatures w14:val="none"/>
+              </w:rPr>
+              <w:t>*</w:t>
+            </w:r>
+          </w:p>
+        </w:tc>
+        <w:tc>
+          <w:tcPr>
+            <w:tcW w:w="1660" w:type="dxa"/>
+            <w:tcBorders>
+              <w:top w:val="nil"/>
+              <w:left w:val="nil"/>
+              <w:bottom w:val="single" w:sz="4" w:space="0" w:color="B7B7B7"/>
+              <w:right w:val="single" w:sz="4" w:space="0" w:color="B7B7B7"/>
+            </w:tcBorders>
+            <w:noWrap/>
+            <w:vAlign w:val="bottom"/>
+            <w:hideMark/>
+          </w:tcPr>
+          <w:p>
+            <w:pPr>
+              <w:spacing w:after="0" w:line="240" w:lineRule="auto"/>
+              <w:jc w:val="center"/>
+              <w:rPr>
+                <w:rFonts w:ascii="Arial" w:eastAsia="Times New Roman" w:hAnsi="Arial" w:cs="Arial"/>
+                <w:kern w:val="0"/>
+                <w:sz w:val="22"/>
+                <w:szCs w:val="22"/>
+                <w:lang w:val="en-SG" w:eastAsia="en-SG"/>
+                <w14:ligatures w14:val="none"/>
+              </w:rPr>
+            </w:pPr>
+            <w:r>
+              <w:rPr>
+                <w:rFonts w:ascii="Arial" w:eastAsia="Times New Roman" w:hAnsi="Arial" w:cs="Arial"/>
+                <w:kern w:val="0"/>
+                <w:sz w:val="22"/>
+                <w:szCs w:val="22"/>
+                <w:lang w:val="en-SG" w:eastAsia="en-SG"/>
+                <w14:ligatures w14:val="none"/>
+              </w:rPr>
+              <w:t>0</w:t>
+            </w:r>
+          </w:p>
+        </w:tc>
+        <w:tc>
+          <w:tcPr>
+            <w:tcW w:w="1980" w:type="dxa"/>
+            <w:tcBorders>
+              <w:top w:val="nil"/>
+              <w:left w:val="nil"/>
+              <w:bottom w:val="single" w:sz="4" w:space="0" w:color="B7B7B7"/>
+              <w:right w:val="single" w:sz="4" w:space="0" w:color="B7B7B7"/>
+            </w:tcBorders>
+            <w:noWrap/>
+            <w:vAlign w:val="bottom"/>
+            <w:hideMark/>
+          </w:tcPr>
+          <w:p>
+            <w:pPr>
+              <w:spacing w:after="0" w:line="240" w:lineRule="auto"/>
+              <w:jc w:val="center"/>
+              <w:rPr>
+                <w:rFonts w:ascii="Arial" w:eastAsia="Times New Roman" w:hAnsi="Arial" w:cs="Arial"/>
+                <w:kern w:val="0"/>
+                <w:sz w:val="22"/>
+                <w:szCs w:val="22"/>
+                <w:lang w:val="en-SG" w:eastAsia="en-SG"/>
+                <w14:ligatures w14:val="none"/>
+              </w:rPr>
+            </w:pPr>
+            <w:r>
+              <w:rPr>
+                <w:rFonts w:ascii="Arial" w:eastAsia="Times New Roman" w:hAnsi="Arial" w:cs="Arial"/>
+                <w:kern w:val="0"/>
+                <w:sz w:val="22"/>
+                <w:szCs w:val="22"/>
+                <w:lang w:val="en-SG" w:eastAsia="en-SG"/>
+                <w14:ligatures w14:val="none"/>
+              </w:rPr>
+              <w:t>No data</w:t>
+            </w:r>
+            <w:r>
+              <w:rPr>
+                <w:rFonts w:ascii="Arial" w:eastAsia="Times New Roman" w:hAnsi="Arial" w:cs="Arial"/>
+                <w:kern w:val="0"/>
+                <w:sz w:val="22"/>
+                <w:szCs w:val="22"/>
+                <w:lang w:val="en-SG" w:eastAsia="en-SG"/>
+                <w14:ligatures w14:val="none"/>
+              </w:rPr>
+              <w:t>*</w:t>
+            </w:r>
+          </w:p>
+        </w:tc>
+      </w:tr>
+      <w:tr>
+        <w:trPr>
+          <w:trHeight w:val="290"/>
+        </w:trPr>
+        <w:tc>
+          <w:tcPr>
+            <w:tcW w:w="1760" w:type="dxa"/>
+            <w:tcBorders>
+              <w:top w:val="nil"/>
+              <w:left w:val="single" w:sz="4" w:space="0" w:color="B7B7B7"/>
+              <w:bottom w:val="single" w:sz="4" w:space="0" w:color="B7B7B7"/>
+              <w:right w:val="single" w:sz="4" w:space="0" w:color="B7B7B7"/>
+            </w:tcBorders>
+            <w:noWrap/>
+            <w:vAlign w:val="bottom"/>
+            <w:hideMark/>
+          </w:tcPr>
+          <w:p>
+            <w:pPr>
+              <w:spacing w:after="0" w:line="240" w:lineRule="auto"/>
+              <w:jc w:val="center"/>
+              <w:rPr>
+                <w:rFonts w:ascii="Arial" w:eastAsia="Times New Roman" w:hAnsi="Arial" w:cs="Arial"/>
+                <w:kern w:val="0"/>
+                <w:sz w:val="22"/>
+                <w:szCs w:val="22"/>
+                <w:lang w:val="en-SG" w:eastAsia="en-SG"/>
+                <w14:ligatures w14:val="none"/>
+              </w:rPr>
+            </w:pPr>
+            <w:r>
+              <w:rPr>
+                <w:rFonts w:ascii="Arial" w:eastAsia="Times New Roman" w:hAnsi="Arial" w:cs="Arial"/>
+                <w:kern w:val="0"/>
+                <w:sz w:val="22"/>
+                <w:szCs w:val="22"/>
+                <w:lang w:val="en-SG" w:eastAsia="en-SG"/>
+                <w14:ligatures w14:val="none"/>
+              </w:rPr>
+              <w:t>New Year's Day</w:t>
+            </w:r>
+          </w:p>
+        </w:tc>
+        <w:tc>
+          <w:tcPr>
+            <w:tcW w:w="880" w:type="dxa"/>
+            <w:tcBorders>
+              <w:top w:val="nil"/>
+              <w:left w:val="nil"/>
+              <w:bottom w:val="single" w:sz="4" w:space="0" w:color="B7B7B7"/>
+              <w:right w:val="single" w:sz="4" w:space="0" w:color="B7B7B7"/>
+            </w:tcBorders>
+            <w:noWrap/>
+            <w:vAlign w:val="bottom"/>
+            <w:hideMark/>
+          </w:tcPr>
+          <w:p>
+            <w:pPr>
+              <w:spacing w:after="0" w:line="240" w:lineRule="auto"/>
+              <w:jc w:val="center"/>
+              <w:rPr>
+                <w:rFonts w:ascii="Arial" w:eastAsia="Times New Roman" w:hAnsi="Arial" w:cs="Arial"/>
+                <w:kern w:val="0"/>
+                <w:sz w:val="22"/>
+                <w:szCs w:val="22"/>
+                <w:lang w:val="en-SG" w:eastAsia="en-SG"/>
+                <w14:ligatures w14:val="none"/>
+              </w:rPr>
+            </w:pPr>
+            <w:r>
+              <w:rPr>
+                <w:rFonts w:ascii="Arial" w:eastAsia="Times New Roman" w:hAnsi="Arial" w:cs="Arial"/>
+                <w:kern w:val="0"/>
+                <w:sz w:val="22"/>
+                <w:szCs w:val="22"/>
+                <w:lang w:val="en-SG" w:eastAsia="en-SG"/>
+                <w14:ligatures w14:val="none"/>
+              </w:rPr>
+              <w:t>2016</w:t>
+            </w:r>
+          </w:p>
+        </w:tc>
+        <w:tc>
+          <w:tcPr>
+            <w:tcW w:w="1540" w:type="dxa"/>
+            <w:tcBorders>
+              <w:top w:val="nil"/>
+              <w:left w:val="nil"/>
+              <w:bottom w:val="single" w:sz="4" w:space="0" w:color="B7B7B7"/>
+              <w:right w:val="single" w:sz="4" w:space="0" w:color="B7B7B7"/>
+            </w:tcBorders>
+            <w:noWrap/>
+            <w:vAlign w:val="bottom"/>
+            <w:hideMark/>
+          </w:tcPr>
+          <w:p>
+            <w:pPr>
+              <w:spacing w:after="0" w:line="240" w:lineRule="auto"/>
+              <w:jc w:val="center"/>
+              <w:rPr>
+                <w:rFonts w:ascii="Arial" w:eastAsia="Times New Roman" w:hAnsi="Arial" w:cs="Arial"/>
+                <w:kern w:val="0"/>
+                <w:sz w:val="22"/>
+                <w:szCs w:val="22"/>
+                <w:lang w:val="en-SG" w:eastAsia="en-SG"/>
+                <w14:ligatures w14:val="none"/>
+              </w:rPr>
+            </w:pPr>
+            <w:r>
+              <w:rPr>
+                <w:rFonts w:ascii="Arial" w:eastAsia="Times New Roman" w:hAnsi="Arial" w:cs="Arial"/>
+                <w:kern w:val="0"/>
+                <w:sz w:val="22"/>
+                <w:szCs w:val="22"/>
+                <w:lang w:val="en-SG" w:eastAsia="en-SG"/>
+                <w14:ligatures w14:val="none"/>
+              </w:rPr>
+              <w:t>-6.06</w:t>
+            </w:r>
+          </w:p>
+        </w:tc>
+        <w:tc>
+          <w:tcPr>
+            <w:tcW w:w="1540" w:type="dxa"/>
+            <w:tcBorders>
+              <w:top w:val="nil"/>
+              <w:left w:val="nil"/>
+              <w:bottom w:val="single" w:sz="4" w:space="0" w:color="B7B7B7"/>
+              <w:right w:val="single" w:sz="4" w:space="0" w:color="B7B7B7"/>
+            </w:tcBorders>
+            <w:noWrap/>
+            <w:vAlign w:val="bottom"/>
+            <w:hideMark/>
+          </w:tcPr>
+          <w:p>
+            <w:pPr>
+              <w:spacing w:after="0" w:line="240" w:lineRule="auto"/>
+              <w:jc w:val="center"/>
+              <w:rPr>
+                <w:rFonts w:ascii="Arial" w:eastAsia="Times New Roman" w:hAnsi="Arial" w:cs="Arial"/>
+                <w:kern w:val="0"/>
+                <w:sz w:val="22"/>
+                <w:szCs w:val="22"/>
+                <w:lang w:val="en-SG" w:eastAsia="en-SG"/>
+                <w14:ligatures w14:val="none"/>
+              </w:rPr>
+            </w:pPr>
+            <w:r>
+              <w:rPr>
+                <w:rFonts w:ascii="Arial" w:eastAsia="Times New Roman" w:hAnsi="Arial" w:cs="Arial"/>
+                <w:kern w:val="0"/>
+                <w:sz w:val="22"/>
+                <w:szCs w:val="22"/>
+                <w:lang w:val="en-SG" w:eastAsia="en-SG"/>
+                <w14:ligatures w14:val="none"/>
+              </w:rPr>
+              <w:t>267.09</w:t>
+            </w:r>
+          </w:p>
+        </w:tc>
+        <w:tc>
+          <w:tcPr>
+            <w:tcW w:w="1660" w:type="dxa"/>
+            <w:tcBorders>
+              <w:top w:val="nil"/>
+              <w:left w:val="nil"/>
+              <w:bottom w:val="single" w:sz="4" w:space="0" w:color="B7B7B7"/>
+              <w:right w:val="single" w:sz="4" w:space="0" w:color="B7B7B7"/>
+            </w:tcBorders>
+            <w:noWrap/>
+            <w:vAlign w:val="bottom"/>
+            <w:hideMark/>
+          </w:tcPr>
+          <w:p>
+            <w:pPr>
+              <w:spacing w:after="0" w:line="240" w:lineRule="auto"/>
+              <w:jc w:val="center"/>
+              <w:rPr>
+                <w:rFonts w:ascii="Arial" w:eastAsia="Times New Roman" w:hAnsi="Arial" w:cs="Arial"/>
+                <w:kern w:val="0"/>
+                <w:sz w:val="22"/>
+                <w:szCs w:val="22"/>
+                <w:lang w:val="en-SG" w:eastAsia="en-SG"/>
+                <w14:ligatures w14:val="none"/>
+              </w:rPr>
+            </w:pPr>
+            <w:r>
+              <w:rPr>
+                <w:rFonts w:ascii="Arial" w:eastAsia="Times New Roman" w:hAnsi="Arial" w:cs="Arial"/>
+                <w:kern w:val="0"/>
+                <w:sz w:val="22"/>
+                <w:szCs w:val="22"/>
+                <w:lang w:val="en-SG" w:eastAsia="en-SG"/>
+                <w14:ligatures w14:val="none"/>
+              </w:rPr>
+              <w:t>18</w:t>
+            </w:r>
+          </w:p>
+        </w:tc>
+        <w:tc>
+          <w:tcPr>
+            <w:tcW w:w="1980" w:type="dxa"/>
+            <w:tcBorders>
+              <w:top w:val="nil"/>
+              <w:left w:val="nil"/>
+              <w:bottom w:val="single" w:sz="4" w:space="0" w:color="B7B7B7"/>
+              <w:right w:val="single" w:sz="4" w:space="0" w:color="B7B7B7"/>
+            </w:tcBorders>
+            <w:noWrap/>
+            <w:vAlign w:val="bottom"/>
+            <w:hideMark/>
+          </w:tcPr>
+          <w:p>
+            <w:pPr>
+              <w:spacing w:after="0" w:line="240" w:lineRule="auto"/>
+              <w:jc w:val="center"/>
+              <w:rPr>
+                <w:rFonts w:ascii="Arial" w:eastAsia="Times New Roman" w:hAnsi="Arial" w:cs="Arial"/>
+                <w:kern w:val="0"/>
+                <w:sz w:val="22"/>
+                <w:szCs w:val="22"/>
+                <w:lang w:val="en-SG" w:eastAsia="en-SG"/>
+                <w14:ligatures w14:val="none"/>
+              </w:rPr>
+            </w:pPr>
+            <w:r>
+              <w:rPr>
+                <w:rFonts w:ascii="Arial" w:eastAsia="Times New Roman" w:hAnsi="Arial" w:cs="Arial"/>
+                <w:kern w:val="0"/>
+                <w:sz w:val="22"/>
+                <w:szCs w:val="22"/>
+                <w:lang w:val="en-SG" w:eastAsia="en-SG"/>
+                <w14:ligatures w14:val="none"/>
+              </w:rPr>
+              <w:t>1832.00</w:t>
+            </w:r>
+          </w:p>
+        </w:tc>
+      </w:tr>
+      <w:tr>
+        <w:trPr>
+          <w:trHeight w:val="290"/>
+        </w:trPr>
+        <w:tc>
+          <w:tcPr>
+            <w:tcW w:w="1760" w:type="dxa"/>
+            <w:tcBorders>
+              <w:top w:val="nil"/>
+              <w:left w:val="single" w:sz="4" w:space="0" w:color="B7B7B7"/>
+              <w:bottom w:val="single" w:sz="4" w:space="0" w:color="B7B7B7"/>
+              <w:right w:val="single" w:sz="4" w:space="0" w:color="B7B7B7"/>
+            </w:tcBorders>
+            <w:noWrap/>
+            <w:vAlign w:val="bottom"/>
+            <w:hideMark/>
+          </w:tcPr>
+          <w:p>
+            <w:pPr>
+              <w:spacing w:after="0" w:line="240" w:lineRule="auto"/>
+              <w:jc w:val="center"/>
+              <w:rPr>
+                <w:rFonts w:ascii="Arial" w:eastAsia="Times New Roman" w:hAnsi="Arial" w:cs="Arial"/>
+                <w:kern w:val="0"/>
+                <w:sz w:val="22"/>
+                <w:szCs w:val="22"/>
+                <w:lang w:val="en-SG" w:eastAsia="en-SG"/>
+                <w14:ligatures w14:val="none"/>
+              </w:rPr>
+            </w:pPr>
+            <w:r>
+              <w:rPr>
+                <w:rFonts w:ascii="Arial" w:eastAsia="Times New Roman" w:hAnsi="Arial" w:cs="Arial"/>
+                <w:kern w:val="0"/>
+                <w:sz w:val="22"/>
+                <w:szCs w:val="22"/>
+                <w:lang w:val="en-SG" w:eastAsia="en-SG"/>
+                <w14:ligatures w14:val="none"/>
+              </w:rPr>
+              <w:t>New Year's Day</w:t>
+            </w:r>
+          </w:p>
+        </w:tc>
+        <w:tc>
+          <w:tcPr>
+            <w:tcW w:w="880" w:type="dxa"/>
+            <w:tcBorders>
+              <w:top w:val="nil"/>
+              <w:left w:val="nil"/>
+              <w:bottom w:val="single" w:sz="4" w:space="0" w:color="B7B7B7"/>
+              <w:right w:val="single" w:sz="4" w:space="0" w:color="B7B7B7"/>
+            </w:tcBorders>
+            <w:noWrap/>
+            <w:vAlign w:val="bottom"/>
+            <w:hideMark/>
+          </w:tcPr>
+          <w:p>
+            <w:pPr>
+              <w:spacing w:after="0" w:line="240" w:lineRule="auto"/>
+              <w:jc w:val="center"/>
+              <w:rPr>
+                <w:rFonts w:ascii="Arial" w:eastAsia="Times New Roman" w:hAnsi="Arial" w:cs="Arial"/>
+                <w:kern w:val="0"/>
+                <w:sz w:val="22"/>
+                <w:szCs w:val="22"/>
+                <w:lang w:val="en-SG" w:eastAsia="en-SG"/>
+                <w14:ligatures w14:val="none"/>
+              </w:rPr>
+            </w:pPr>
+            <w:r>
+              <w:rPr>
+                <w:rFonts w:ascii="Arial" w:eastAsia="Times New Roman" w:hAnsi="Arial" w:cs="Arial"/>
+                <w:kern w:val="0"/>
+                <w:sz w:val="22"/>
+                <w:szCs w:val="22"/>
+                <w:lang w:val="en-SG" w:eastAsia="en-SG"/>
+                <w14:ligatures w14:val="none"/>
+              </w:rPr>
+              <w:t>2017</w:t>
+            </w:r>
+          </w:p>
+        </w:tc>
+        <w:tc>
+          <w:tcPr>
+            <w:tcW w:w="1540" w:type="dxa"/>
+            <w:tcBorders>
+              <w:top w:val="nil"/>
+              <w:left w:val="nil"/>
+              <w:bottom w:val="single" w:sz="4" w:space="0" w:color="B7B7B7"/>
+              <w:right w:val="single" w:sz="4" w:space="0" w:color="B7B7B7"/>
+            </w:tcBorders>
+            <w:noWrap/>
+            <w:vAlign w:val="bottom"/>
+            <w:hideMark/>
+          </w:tcPr>
+          <w:p>
+            <w:pPr>
+              <w:spacing w:after="0" w:line="240" w:lineRule="auto"/>
+              <w:jc w:val="center"/>
+              <w:rPr>
+                <w:rFonts w:ascii="Arial" w:eastAsia="Times New Roman" w:hAnsi="Arial" w:cs="Arial"/>
+                <w:kern w:val="0"/>
+                <w:sz w:val="22"/>
+                <w:szCs w:val="22"/>
+                <w:lang w:val="en-SG" w:eastAsia="en-SG"/>
+                <w14:ligatures w14:val="none"/>
+              </w:rPr>
+            </w:pPr>
+            <w:r>
+              <w:rPr>
+                <w:rFonts w:ascii="Arial" w:eastAsia="Times New Roman" w:hAnsi="Arial" w:cs="Arial"/>
+                <w:kern w:val="0"/>
+                <w:sz w:val="22"/>
+                <w:szCs w:val="22"/>
+                <w:lang w:val="en-SG" w:eastAsia="en-SG"/>
+                <w14:ligatures w14:val="none"/>
+              </w:rPr>
+              <w:t>-3.06</w:t>
+            </w:r>
+          </w:p>
+        </w:tc>
+        <w:tc>
+          <w:tcPr>
+            <w:tcW w:w="1540" w:type="dxa"/>
+            <w:tcBorders>
+              <w:top w:val="nil"/>
+              <w:left w:val="nil"/>
+              <w:bottom w:val="single" w:sz="4" w:space="0" w:color="B7B7B7"/>
+              <w:right w:val="single" w:sz="4" w:space="0" w:color="B7B7B7"/>
+            </w:tcBorders>
+            <w:noWrap/>
+            <w:vAlign w:val="bottom"/>
+            <w:hideMark/>
+          </w:tcPr>
+          <w:p>
+            <w:pPr>
+              <w:spacing w:after="0" w:line="240" w:lineRule="auto"/>
+              <w:jc w:val="center"/>
+              <w:rPr>
+                <w:rFonts w:ascii="Arial" w:eastAsia="Times New Roman" w:hAnsi="Arial" w:cs="Arial"/>
+                <w:kern w:val="0"/>
+                <w:sz w:val="22"/>
+                <w:szCs w:val="22"/>
+                <w:lang w:val="en-SG" w:eastAsia="en-SG"/>
+                <w14:ligatures w14:val="none"/>
+              </w:rPr>
+            </w:pPr>
+            <w:r>
+              <w:rPr>
+                <w:rFonts w:ascii="Arial" w:eastAsia="Times New Roman" w:hAnsi="Arial" w:cs="Arial"/>
+                <w:kern w:val="0"/>
+                <w:sz w:val="22"/>
+                <w:szCs w:val="22"/>
+                <w:lang w:val="en-SG" w:eastAsia="en-SG"/>
+                <w14:ligatures w14:val="none"/>
+              </w:rPr>
+              <w:t>270.09</w:t>
+            </w:r>
+          </w:p>
+        </w:tc>
+        <w:tc>
+          <w:tcPr>
+            <w:tcW w:w="1660" w:type="dxa"/>
+            <w:tcBorders>
+              <w:top w:val="nil"/>
+              <w:left w:val="nil"/>
+              <w:bottom w:val="single" w:sz="4" w:space="0" w:color="B7B7B7"/>
+              <w:right w:val="single" w:sz="4" w:space="0" w:color="B7B7B7"/>
+            </w:tcBorders>
+            <w:noWrap/>
+            <w:vAlign w:val="bottom"/>
+            <w:hideMark/>
+          </w:tcPr>
+          <w:p>
+            <w:pPr>
+              <w:spacing w:after="0" w:line="240" w:lineRule="auto"/>
+              <w:jc w:val="center"/>
+              <w:rPr>
+                <w:rFonts w:ascii="Arial" w:eastAsia="Times New Roman" w:hAnsi="Arial" w:cs="Arial"/>
+                <w:kern w:val="0"/>
+                <w:sz w:val="22"/>
+                <w:szCs w:val="22"/>
+                <w:lang w:val="en-SG" w:eastAsia="en-SG"/>
+                <w14:ligatures w14:val="none"/>
+              </w:rPr>
+            </w:pPr>
+            <w:r>
+              <w:rPr>
+                <w:rFonts w:ascii="Arial" w:eastAsia="Times New Roman" w:hAnsi="Arial" w:cs="Arial"/>
+                <w:kern w:val="0"/>
+                <w:sz w:val="22"/>
+                <w:szCs w:val="22"/>
+                <w:lang w:val="en-SG" w:eastAsia="en-SG"/>
+                <w14:ligatures w14:val="none"/>
+              </w:rPr>
+              <w:t>24</w:t>
+            </w:r>
+          </w:p>
+        </w:tc>
+        <w:tc>
+          <w:tcPr>
+            <w:tcW w:w="1980" w:type="dxa"/>
+            <w:tcBorders>
+              <w:top w:val="nil"/>
+              <w:left w:val="nil"/>
+              <w:bottom w:val="single" w:sz="4" w:space="0" w:color="B7B7B7"/>
+              <w:right w:val="single" w:sz="4" w:space="0" w:color="B7B7B7"/>
+            </w:tcBorders>
+            <w:noWrap/>
+            <w:vAlign w:val="bottom"/>
+            <w:hideMark/>
+          </w:tcPr>
+          <w:p>
+            <w:pPr>
+              <w:spacing w:after="0" w:line="240" w:lineRule="auto"/>
+              <w:jc w:val="center"/>
+              <w:rPr>
+                <w:rFonts w:ascii="Arial" w:eastAsia="Times New Roman" w:hAnsi="Arial" w:cs="Arial"/>
+                <w:kern w:val="0"/>
+                <w:sz w:val="22"/>
+                <w:szCs w:val="22"/>
+                <w:lang w:val="en-SG" w:eastAsia="en-SG"/>
+                <w14:ligatures w14:val="none"/>
+              </w:rPr>
+            </w:pPr>
+            <w:r>
+              <w:rPr>
+                <w:rFonts w:ascii="Arial" w:eastAsia="Times New Roman" w:hAnsi="Arial" w:cs="Arial"/>
+                <w:kern w:val="0"/>
+                <w:sz w:val="22"/>
+                <w:szCs w:val="22"/>
+                <w:lang w:val="en-SG" w:eastAsia="en-SG"/>
+                <w14:ligatures w14:val="none"/>
+              </w:rPr>
+              <w:t>2127.60</w:t>
+            </w:r>
+          </w:p>
+        </w:tc>
+      </w:tr>
+      <w:tr>
+        <w:trPr>
+          <w:trHeight w:val="290"/>
+        </w:trPr>
+        <w:tc>
+          <w:tcPr>
+            <w:tcW w:w="1760" w:type="dxa"/>
+            <w:tcBorders>
+              <w:top w:val="nil"/>
+              <w:left w:val="single" w:sz="4" w:space="0" w:color="B7B7B7"/>
+              <w:bottom w:val="single" w:sz="4" w:space="0" w:color="B7B7B7"/>
+              <w:right w:val="single" w:sz="4" w:space="0" w:color="B7B7B7"/>
+            </w:tcBorders>
+            <w:noWrap/>
+            <w:vAlign w:val="bottom"/>
+            <w:hideMark/>
+          </w:tcPr>
+          <w:p>
+            <w:pPr>
+              <w:spacing w:after="0" w:line="240" w:lineRule="auto"/>
+              <w:jc w:val="center"/>
+              <w:rPr>
+                <w:rFonts w:ascii="Arial" w:eastAsia="Times New Roman" w:hAnsi="Arial" w:cs="Arial"/>
+                <w:kern w:val="0"/>
+                <w:sz w:val="22"/>
+                <w:szCs w:val="22"/>
+                <w:lang w:val="en-SG" w:eastAsia="en-SG"/>
+                <w14:ligatures w14:val="none"/>
+              </w:rPr>
+            </w:pPr>
+            <w:r>
+              <w:rPr>
+                <w:rFonts w:ascii="Arial" w:eastAsia="Times New Roman" w:hAnsi="Arial" w:cs="Arial"/>
+                <w:kern w:val="0"/>
+                <w:sz w:val="22"/>
+                <w:szCs w:val="22"/>
+                <w:lang w:val="en-SG" w:eastAsia="en-SG"/>
+                <w14:ligatures w14:val="none"/>
+              </w:rPr>
+              <w:t>Labor Day</w:t>
+            </w:r>
+          </w:p>
+        </w:tc>
+        <w:tc>
+          <w:tcPr>
+            <w:tcW w:w="880" w:type="dxa"/>
+            <w:tcBorders>
+              <w:top w:val="nil"/>
+              <w:left w:val="nil"/>
+              <w:bottom w:val="single" w:sz="4" w:space="0" w:color="B7B7B7"/>
+              <w:right w:val="single" w:sz="4" w:space="0" w:color="B7B7B7"/>
+            </w:tcBorders>
+            <w:noWrap/>
+            <w:vAlign w:val="bottom"/>
+            <w:hideMark/>
+          </w:tcPr>
+          <w:p>
+            <w:pPr>
+              <w:spacing w:after="0" w:line="240" w:lineRule="auto"/>
+              <w:jc w:val="center"/>
+              <w:rPr>
+                <w:rFonts w:ascii="Arial" w:eastAsia="Times New Roman" w:hAnsi="Arial" w:cs="Arial"/>
+                <w:kern w:val="0"/>
+                <w:sz w:val="22"/>
+                <w:szCs w:val="22"/>
+                <w:lang w:val="en-SG" w:eastAsia="en-SG"/>
+                <w14:ligatures w14:val="none"/>
+              </w:rPr>
+            </w:pPr>
+            <w:r>
+              <w:rPr>
+                <w:rFonts w:ascii="Arial" w:eastAsia="Times New Roman" w:hAnsi="Arial" w:cs="Arial"/>
+                <w:kern w:val="0"/>
+                <w:sz w:val="22"/>
+                <w:szCs w:val="22"/>
+                <w:lang w:val="en-SG" w:eastAsia="en-SG"/>
+                <w14:ligatures w14:val="none"/>
+              </w:rPr>
+              <w:t>2015</w:t>
+            </w:r>
+          </w:p>
+        </w:tc>
+        <w:tc>
+          <w:tcPr>
+            <w:tcW w:w="1540" w:type="dxa"/>
+            <w:tcBorders>
+              <w:top w:val="nil"/>
+              <w:left w:val="nil"/>
+              <w:bottom w:val="single" w:sz="4" w:space="0" w:color="B7B7B7"/>
+              <w:right w:val="single" w:sz="4" w:space="0" w:color="B7B7B7"/>
+            </w:tcBorders>
+            <w:noWrap/>
+            <w:vAlign w:val="bottom"/>
+            <w:hideMark/>
+          </w:tcPr>
+          <w:p>
+            <w:pPr>
+              <w:spacing w:after="0" w:line="240" w:lineRule="auto"/>
+              <w:jc w:val="center"/>
+              <w:rPr>
+                <w:rFonts w:ascii="Arial" w:eastAsia="Times New Roman" w:hAnsi="Arial" w:cs="Arial"/>
+                <w:kern w:val="0"/>
+                <w:sz w:val="22"/>
+                <w:szCs w:val="22"/>
+                <w:lang w:val="en-SG" w:eastAsia="en-SG"/>
+                <w14:ligatures w14:val="none"/>
+              </w:rPr>
+            </w:pPr>
+            <w:r>
+              <w:rPr>
+                <w:rFonts w:ascii="Arial" w:eastAsia="Times New Roman" w:hAnsi="Arial" w:cs="Arial"/>
+                <w:kern w:val="0"/>
+                <w:sz w:val="22"/>
+                <w:szCs w:val="22"/>
+                <w:lang w:val="en-SG" w:eastAsia="en-SG"/>
+                <w14:ligatures w14:val="none"/>
+              </w:rPr>
+              <w:t>22.17</w:t>
+            </w:r>
+          </w:p>
+        </w:tc>
+        <w:tc>
+          <w:tcPr>
+            <w:tcW w:w="1540" w:type="dxa"/>
+            <w:tcBorders>
+              <w:top w:val="nil"/>
+              <w:left w:val="nil"/>
+              <w:bottom w:val="single" w:sz="4" w:space="0" w:color="B7B7B7"/>
+              <w:right w:val="single" w:sz="4" w:space="0" w:color="B7B7B7"/>
+            </w:tcBorders>
+            <w:noWrap/>
+            <w:vAlign w:val="bottom"/>
+            <w:hideMark/>
+          </w:tcPr>
+          <w:p>
+            <w:pPr>
+              <w:spacing w:after="0" w:line="240" w:lineRule="auto"/>
+              <w:jc w:val="center"/>
+              <w:rPr>
+                <w:rFonts w:ascii="Arial" w:eastAsia="Times New Roman" w:hAnsi="Arial" w:cs="Arial"/>
+                <w:kern w:val="0"/>
+                <w:sz w:val="22"/>
+                <w:szCs w:val="22"/>
+                <w:lang w:val="en-SG" w:eastAsia="en-SG"/>
+                <w14:ligatures w14:val="none"/>
+              </w:rPr>
+            </w:pPr>
+            <w:r>
+              <w:rPr>
+                <w:rFonts w:ascii="Arial" w:eastAsia="Times New Roman" w:hAnsi="Arial" w:cs="Arial"/>
+                <w:kern w:val="0"/>
+                <w:sz w:val="22"/>
+                <w:szCs w:val="22"/>
+                <w:lang w:val="en-SG" w:eastAsia="en-SG"/>
+                <w14:ligatures w14:val="none"/>
+              </w:rPr>
+              <w:t>295.32</w:t>
+            </w:r>
+          </w:p>
+        </w:tc>
+        <w:tc>
+          <w:tcPr>
+            <w:tcW w:w="1660" w:type="dxa"/>
+            <w:tcBorders>
+              <w:top w:val="nil"/>
+              <w:left w:val="nil"/>
+              <w:bottom w:val="single" w:sz="4" w:space="0" w:color="B7B7B7"/>
+              <w:right w:val="single" w:sz="4" w:space="0" w:color="B7B7B7"/>
+            </w:tcBorders>
+            <w:noWrap/>
+            <w:vAlign w:val="bottom"/>
+            <w:hideMark/>
+          </w:tcPr>
+          <w:p>
+            <w:pPr>
+              <w:spacing w:after="0" w:line="240" w:lineRule="auto"/>
+              <w:jc w:val="center"/>
+              <w:rPr>
+                <w:rFonts w:ascii="Arial" w:eastAsia="Times New Roman" w:hAnsi="Arial" w:cs="Arial"/>
+                <w:kern w:val="0"/>
+                <w:sz w:val="22"/>
+                <w:szCs w:val="22"/>
+                <w:lang w:val="en-SG" w:eastAsia="en-SG"/>
+                <w14:ligatures w14:val="none"/>
+              </w:rPr>
+            </w:pPr>
+            <w:r>
+              <w:rPr>
+                <w:rFonts w:ascii="Arial" w:eastAsia="Times New Roman" w:hAnsi="Arial" w:cs="Arial"/>
+                <w:kern w:val="0"/>
+                <w:sz w:val="22"/>
+                <w:szCs w:val="22"/>
+                <w:lang w:val="en-SG" w:eastAsia="en-SG"/>
+                <w14:ligatures w14:val="none"/>
+              </w:rPr>
+              <w:t>24</w:t>
+            </w:r>
+          </w:p>
+        </w:tc>
+        <w:tc>
+          <w:tcPr>
+            <w:tcW w:w="1980" w:type="dxa"/>
+            <w:tcBorders>
+              <w:top w:val="nil"/>
+              <w:left w:val="nil"/>
+              <w:bottom w:val="single" w:sz="4" w:space="0" w:color="B7B7B7"/>
+              <w:right w:val="single" w:sz="4" w:space="0" w:color="B7B7B7"/>
+            </w:tcBorders>
+            <w:noWrap/>
+            <w:vAlign w:val="bottom"/>
+            <w:hideMark/>
+          </w:tcPr>
+          <w:p>
+            <w:pPr>
+              <w:spacing w:after="0" w:line="240" w:lineRule="auto"/>
+              <w:jc w:val="center"/>
+              <w:rPr>
+                <w:rFonts w:ascii="Arial" w:eastAsia="Times New Roman" w:hAnsi="Arial" w:cs="Arial"/>
+                <w:kern w:val="0"/>
+                <w:sz w:val="22"/>
+                <w:szCs w:val="22"/>
+                <w:lang w:val="en-SG" w:eastAsia="en-SG"/>
+                <w14:ligatures w14:val="none"/>
+              </w:rPr>
+            </w:pPr>
+            <w:r>
+              <w:rPr>
+                <w:rFonts w:ascii="Arial" w:eastAsia="Times New Roman" w:hAnsi="Arial" w:cs="Arial"/>
+                <w:kern w:val="0"/>
+                <w:sz w:val="22"/>
+                <w:szCs w:val="22"/>
+                <w:lang w:val="en-SG" w:eastAsia="en-SG"/>
+                <w14:ligatures w14:val="none"/>
+              </w:rPr>
+              <w:t>2430.30</w:t>
+            </w:r>
+          </w:p>
+        </w:tc>
+      </w:tr>
+      <w:tr>
+        <w:trPr>
+          <w:trHeight w:val="290"/>
+        </w:trPr>
+        <w:tc>
+          <w:tcPr>
+            <w:tcW w:w="1760" w:type="dxa"/>
+            <w:tcBorders>
+              <w:top w:val="nil"/>
+              <w:left w:val="single" w:sz="4" w:space="0" w:color="B7B7B7"/>
+              <w:bottom w:val="single" w:sz="4" w:space="0" w:color="B7B7B7"/>
+              <w:right w:val="single" w:sz="4" w:space="0" w:color="B7B7B7"/>
+            </w:tcBorders>
+            <w:noWrap/>
+            <w:vAlign w:val="bottom"/>
+            <w:hideMark/>
+          </w:tcPr>
+          <w:p>
+            <w:pPr>
+              <w:spacing w:after="0" w:line="240" w:lineRule="auto"/>
+              <w:jc w:val="center"/>
+              <w:rPr>
+                <w:rFonts w:ascii="Arial" w:eastAsia="Times New Roman" w:hAnsi="Arial" w:cs="Arial"/>
+                <w:kern w:val="0"/>
+                <w:sz w:val="22"/>
+                <w:szCs w:val="22"/>
+                <w:lang w:val="en-SG" w:eastAsia="en-SG"/>
+                <w14:ligatures w14:val="none"/>
+              </w:rPr>
+            </w:pPr>
+            <w:r>
+              <w:rPr>
+                <w:rFonts w:ascii="Arial" w:eastAsia="Times New Roman" w:hAnsi="Arial" w:cs="Arial"/>
+                <w:kern w:val="0"/>
+                <w:sz w:val="22"/>
+                <w:szCs w:val="22"/>
+                <w:lang w:val="en-SG" w:eastAsia="en-SG"/>
+                <w14:ligatures w14:val="none"/>
+              </w:rPr>
+              <w:t>Labor Day</w:t>
+            </w:r>
+          </w:p>
+        </w:tc>
+        <w:tc>
+          <w:tcPr>
+            <w:tcW w:w="880" w:type="dxa"/>
+            <w:tcBorders>
+              <w:top w:val="nil"/>
+              <w:left w:val="nil"/>
+              <w:bottom w:val="single" w:sz="4" w:space="0" w:color="B7B7B7"/>
+              <w:right w:val="single" w:sz="4" w:space="0" w:color="B7B7B7"/>
+            </w:tcBorders>
+            <w:noWrap/>
+            <w:vAlign w:val="bottom"/>
+            <w:hideMark/>
+          </w:tcPr>
+          <w:p>
+            <w:pPr>
+              <w:spacing w:after="0" w:line="240" w:lineRule="auto"/>
+              <w:jc w:val="center"/>
+              <w:rPr>
+                <w:rFonts w:ascii="Arial" w:eastAsia="Times New Roman" w:hAnsi="Arial" w:cs="Arial"/>
+                <w:kern w:val="0"/>
+                <w:sz w:val="22"/>
+                <w:szCs w:val="22"/>
+                <w:lang w:val="en-SG" w:eastAsia="en-SG"/>
+                <w14:ligatures w14:val="none"/>
+              </w:rPr>
+            </w:pPr>
+            <w:r>
+              <w:rPr>
+                <w:rFonts w:ascii="Arial" w:eastAsia="Times New Roman" w:hAnsi="Arial" w:cs="Arial"/>
+                <w:kern w:val="0"/>
+                <w:sz w:val="22"/>
+                <w:szCs w:val="22"/>
+                <w:lang w:val="en-SG" w:eastAsia="en-SG"/>
+                <w14:ligatures w14:val="none"/>
+              </w:rPr>
+              <w:t>2016</w:t>
+            </w:r>
+          </w:p>
+        </w:tc>
+        <w:tc>
+          <w:tcPr>
+            <w:tcW w:w="1540" w:type="dxa"/>
+            <w:tcBorders>
+              <w:top w:val="nil"/>
+              <w:left w:val="nil"/>
+              <w:bottom w:val="single" w:sz="4" w:space="0" w:color="B7B7B7"/>
+              <w:right w:val="single" w:sz="4" w:space="0" w:color="B7B7B7"/>
+            </w:tcBorders>
+            <w:noWrap/>
+            <w:vAlign w:val="bottom"/>
+            <w:hideMark/>
+          </w:tcPr>
+          <w:p>
+            <w:pPr>
+              <w:spacing w:after="0" w:line="240" w:lineRule="auto"/>
+              <w:jc w:val="center"/>
+              <w:rPr>
+                <w:rFonts w:ascii="Arial" w:eastAsia="Times New Roman" w:hAnsi="Arial" w:cs="Arial"/>
+                <w:kern w:val="0"/>
+                <w:sz w:val="22"/>
+                <w:szCs w:val="22"/>
+                <w:lang w:val="en-SG" w:eastAsia="en-SG"/>
+                <w14:ligatures w14:val="none"/>
+              </w:rPr>
+            </w:pPr>
+            <w:r>
+              <w:rPr>
+                <w:rFonts w:ascii="Arial" w:eastAsia="Times New Roman" w:hAnsi="Arial" w:cs="Arial"/>
+                <w:kern w:val="0"/>
+                <w:sz w:val="22"/>
+                <w:szCs w:val="22"/>
+                <w:lang w:val="en-SG" w:eastAsia="en-SG"/>
+                <w14:ligatures w14:val="none"/>
+              </w:rPr>
+              <w:t>21.86</w:t>
+            </w:r>
+          </w:p>
+        </w:tc>
+        <w:tc>
+          <w:tcPr>
+            <w:tcW w:w="1540" w:type="dxa"/>
+            <w:tcBorders>
+              <w:top w:val="nil"/>
+              <w:left w:val="nil"/>
+              <w:bottom w:val="single" w:sz="4" w:space="0" w:color="B7B7B7"/>
+              <w:right w:val="single" w:sz="4" w:space="0" w:color="B7B7B7"/>
+            </w:tcBorders>
+            <w:noWrap/>
+            <w:vAlign w:val="bottom"/>
+            <w:hideMark/>
+          </w:tcPr>
+          <w:p>
+            <w:pPr>
+              <w:spacing w:after="0" w:line="240" w:lineRule="auto"/>
+              <w:jc w:val="center"/>
+              <w:rPr>
+                <w:rFonts w:ascii="Arial" w:eastAsia="Times New Roman" w:hAnsi="Arial" w:cs="Arial"/>
+                <w:kern w:val="0"/>
+                <w:sz w:val="22"/>
+                <w:szCs w:val="22"/>
+                <w:lang w:val="en-SG" w:eastAsia="en-SG"/>
+                <w14:ligatures w14:val="none"/>
+              </w:rPr>
+            </w:pPr>
+            <w:r>
+              <w:rPr>
+                <w:rFonts w:ascii="Arial" w:eastAsia="Times New Roman" w:hAnsi="Arial" w:cs="Arial"/>
+                <w:kern w:val="0"/>
+                <w:sz w:val="22"/>
+                <w:szCs w:val="22"/>
+                <w:lang w:val="en-SG" w:eastAsia="en-SG"/>
+                <w14:ligatures w14:val="none"/>
+              </w:rPr>
+              <w:t>295.01</w:t>
+            </w:r>
+          </w:p>
+        </w:tc>
+        <w:tc>
+          <w:tcPr>
+            <w:tcW w:w="1660" w:type="dxa"/>
+            <w:tcBorders>
+              <w:top w:val="nil"/>
+              <w:left w:val="nil"/>
+              <w:bottom w:val="single" w:sz="4" w:space="0" w:color="B7B7B7"/>
+              <w:right w:val="single" w:sz="4" w:space="0" w:color="B7B7B7"/>
+            </w:tcBorders>
+            <w:noWrap/>
+            <w:vAlign w:val="bottom"/>
+            <w:hideMark/>
+          </w:tcPr>
+          <w:p>
+            <w:pPr>
+              <w:spacing w:after="0" w:line="240" w:lineRule="auto"/>
+              <w:jc w:val="center"/>
+              <w:rPr>
+                <w:rFonts w:ascii="Arial" w:eastAsia="Times New Roman" w:hAnsi="Arial" w:cs="Arial"/>
+                <w:kern w:val="0"/>
+                <w:sz w:val="22"/>
+                <w:szCs w:val="22"/>
+                <w:lang w:val="en-SG" w:eastAsia="en-SG"/>
+                <w14:ligatures w14:val="none"/>
+              </w:rPr>
+            </w:pPr>
+            <w:r>
+              <w:rPr>
+                <w:rFonts w:ascii="Arial" w:eastAsia="Times New Roman" w:hAnsi="Arial" w:cs="Arial"/>
+                <w:kern w:val="0"/>
+                <w:sz w:val="22"/>
+                <w:szCs w:val="22"/>
+                <w:lang w:val="en-SG" w:eastAsia="en-SG"/>
+                <w14:ligatures w14:val="none"/>
+              </w:rPr>
+              <w:t>24</w:t>
+            </w:r>
+          </w:p>
+        </w:tc>
+        <w:tc>
+          <w:tcPr>
+            <w:tcW w:w="1980" w:type="dxa"/>
+            <w:tcBorders>
+              <w:top w:val="nil"/>
+              <w:left w:val="nil"/>
+              <w:bottom w:val="single" w:sz="4" w:space="0" w:color="B7B7B7"/>
+              <w:right w:val="single" w:sz="4" w:space="0" w:color="B7B7B7"/>
+            </w:tcBorders>
+            <w:noWrap/>
+            <w:vAlign w:val="bottom"/>
+            <w:hideMark/>
+          </w:tcPr>
+          <w:p>
+            <w:pPr>
+              <w:spacing w:after="0" w:line="240" w:lineRule="auto"/>
+              <w:jc w:val="center"/>
+              <w:rPr>
+                <w:rFonts w:ascii="Arial" w:eastAsia="Times New Roman" w:hAnsi="Arial" w:cs="Arial"/>
+                <w:kern w:val="0"/>
+                <w:sz w:val="22"/>
+                <w:szCs w:val="22"/>
+                <w:lang w:val="en-SG" w:eastAsia="en-SG"/>
+                <w14:ligatures w14:val="none"/>
+              </w:rPr>
+            </w:pPr>
+            <w:r>
+              <w:rPr>
+                <w:rFonts w:ascii="Arial" w:eastAsia="Times New Roman" w:hAnsi="Arial" w:cs="Arial"/>
+                <w:kern w:val="0"/>
+                <w:sz w:val="22"/>
+                <w:szCs w:val="22"/>
+                <w:lang w:val="en-SG" w:eastAsia="en-SG"/>
+                <w14:ligatures w14:val="none"/>
+              </w:rPr>
+              <w:t>2151.50</w:t>
+            </w:r>
+          </w:p>
+        </w:tc>
+      </w:tr>
+      <w:tr>
+        <w:trPr>
+          <w:trHeight w:val="290"/>
+        </w:trPr>
+        <w:tc>
+          <w:tcPr>
+            <w:tcW w:w="1760" w:type="dxa"/>
+            <w:tcBorders>
+              <w:top w:val="nil"/>
+              <w:left w:val="single" w:sz="4" w:space="0" w:color="B7B7B7"/>
+              <w:bottom w:val="single" w:sz="4" w:space="0" w:color="B7B7B7"/>
+              <w:right w:val="single" w:sz="4" w:space="0" w:color="B7B7B7"/>
+            </w:tcBorders>
+            <w:noWrap/>
+            <w:vAlign w:val="bottom"/>
+            <w:hideMark/>
+          </w:tcPr>
+          <w:p>
+            <w:pPr>
+              <w:spacing w:after="0" w:line="240" w:lineRule="auto"/>
+              <w:jc w:val="center"/>
+              <w:rPr>
+                <w:rFonts w:ascii="Arial" w:eastAsia="Times New Roman" w:hAnsi="Arial" w:cs="Arial"/>
+                <w:kern w:val="0"/>
+                <w:sz w:val="22"/>
+                <w:szCs w:val="22"/>
+                <w:lang w:val="en-SG" w:eastAsia="en-SG"/>
+                <w14:ligatures w14:val="none"/>
+              </w:rPr>
+            </w:pPr>
+            <w:r>
+              <w:rPr>
+                <w:rFonts w:ascii="Arial" w:eastAsia="Times New Roman" w:hAnsi="Arial" w:cs="Arial"/>
+                <w:kern w:val="0"/>
+                <w:sz w:val="22"/>
+                <w:szCs w:val="22"/>
+                <w:lang w:val="en-SG" w:eastAsia="en-SG"/>
+                <w14:ligatures w14:val="none"/>
+              </w:rPr>
+              <w:t>Labor Day</w:t>
+            </w:r>
+          </w:p>
+        </w:tc>
+        <w:tc>
+          <w:tcPr>
+            <w:tcW w:w="880" w:type="dxa"/>
+            <w:tcBorders>
+              <w:top w:val="nil"/>
+              <w:left w:val="nil"/>
+              <w:bottom w:val="single" w:sz="4" w:space="0" w:color="B7B7B7"/>
+              <w:right w:val="single" w:sz="4" w:space="0" w:color="B7B7B7"/>
+            </w:tcBorders>
+            <w:noWrap/>
+            <w:vAlign w:val="bottom"/>
+            <w:hideMark/>
+          </w:tcPr>
+          <w:p>
+            <w:pPr>
+              <w:spacing w:after="0" w:line="240" w:lineRule="auto"/>
+              <w:jc w:val="center"/>
+              <w:rPr>
+                <w:rFonts w:ascii="Arial" w:eastAsia="Times New Roman" w:hAnsi="Arial" w:cs="Arial"/>
+                <w:kern w:val="0"/>
+                <w:sz w:val="22"/>
+                <w:szCs w:val="22"/>
+                <w:lang w:val="en-SG" w:eastAsia="en-SG"/>
+                <w14:ligatures w14:val="none"/>
+              </w:rPr>
+            </w:pPr>
+            <w:r>
+              <w:rPr>
+                <w:rFonts w:ascii="Arial" w:eastAsia="Times New Roman" w:hAnsi="Arial" w:cs="Arial"/>
+                <w:kern w:val="0"/>
+                <w:sz w:val="22"/>
+                <w:szCs w:val="22"/>
+                <w:lang w:val="en-SG" w:eastAsia="en-SG"/>
+                <w14:ligatures w14:val="none"/>
+              </w:rPr>
+              <w:t>2017</w:t>
+            </w:r>
+          </w:p>
+        </w:tc>
+        <w:tc>
+          <w:tcPr>
+            <w:tcW w:w="1540" w:type="dxa"/>
+            <w:tcBorders>
+              <w:top w:val="nil"/>
+              <w:left w:val="nil"/>
+              <w:bottom w:val="single" w:sz="4" w:space="0" w:color="B7B7B7"/>
+              <w:right w:val="single" w:sz="4" w:space="0" w:color="B7B7B7"/>
+            </w:tcBorders>
+            <w:noWrap/>
+            <w:vAlign w:val="bottom"/>
+            <w:hideMark/>
+          </w:tcPr>
+          <w:p>
+            <w:pPr>
+              <w:spacing w:after="0" w:line="240" w:lineRule="auto"/>
+              <w:jc w:val="center"/>
+              <w:rPr>
+                <w:rFonts w:ascii="Arial" w:eastAsia="Times New Roman" w:hAnsi="Arial" w:cs="Arial"/>
+                <w:kern w:val="0"/>
+                <w:sz w:val="22"/>
+                <w:szCs w:val="22"/>
+                <w:lang w:val="en-SG" w:eastAsia="en-SG"/>
+                <w14:ligatures w14:val="none"/>
+              </w:rPr>
+            </w:pPr>
+            <w:r>
+              <w:rPr>
+                <w:rFonts w:ascii="Arial" w:eastAsia="Times New Roman" w:hAnsi="Arial" w:cs="Arial"/>
+                <w:kern w:val="0"/>
+                <w:sz w:val="22"/>
+                <w:szCs w:val="22"/>
+                <w:lang w:val="en-SG" w:eastAsia="en-SG"/>
+                <w14:ligatures w14:val="none"/>
+              </w:rPr>
+              <w:t>18.14</w:t>
+            </w:r>
+          </w:p>
+        </w:tc>
+        <w:tc>
+          <w:tcPr>
+            <w:tcW w:w="1540" w:type="dxa"/>
+            <w:tcBorders>
+              <w:top w:val="nil"/>
+              <w:left w:val="nil"/>
+              <w:bottom w:val="single" w:sz="4" w:space="0" w:color="B7B7B7"/>
+              <w:right w:val="single" w:sz="4" w:space="0" w:color="B7B7B7"/>
+            </w:tcBorders>
+            <w:noWrap/>
+            <w:vAlign w:val="bottom"/>
+            <w:hideMark/>
+          </w:tcPr>
+          <w:p>
+            <w:pPr>
+              <w:spacing w:after="0" w:line="240" w:lineRule="auto"/>
+              <w:jc w:val="center"/>
+              <w:rPr>
+                <w:rFonts w:ascii="Arial" w:eastAsia="Times New Roman" w:hAnsi="Arial" w:cs="Arial"/>
+                <w:kern w:val="0"/>
+                <w:sz w:val="22"/>
+                <w:szCs w:val="22"/>
+                <w:lang w:val="en-SG" w:eastAsia="en-SG"/>
+                <w14:ligatures w14:val="none"/>
+              </w:rPr>
+            </w:pPr>
+            <w:r>
+              <w:rPr>
+                <w:rFonts w:ascii="Arial" w:eastAsia="Times New Roman" w:hAnsi="Arial" w:cs="Arial"/>
+                <w:kern w:val="0"/>
+                <w:sz w:val="22"/>
+                <w:szCs w:val="22"/>
+                <w:lang w:val="en-SG" w:eastAsia="en-SG"/>
+                <w14:ligatures w14:val="none"/>
+              </w:rPr>
+              <w:t>291.29</w:t>
+            </w:r>
+          </w:p>
+        </w:tc>
+        <w:tc>
+          <w:tcPr>
+            <w:tcW w:w="1660" w:type="dxa"/>
+            <w:tcBorders>
+              <w:top w:val="nil"/>
+              <w:left w:val="nil"/>
+              <w:bottom w:val="single" w:sz="4" w:space="0" w:color="B7B7B7"/>
+              <w:right w:val="single" w:sz="4" w:space="0" w:color="B7B7B7"/>
+            </w:tcBorders>
+            <w:noWrap/>
+            <w:vAlign w:val="bottom"/>
+            <w:hideMark/>
+          </w:tcPr>
+          <w:p>
+            <w:pPr>
+              <w:spacing w:after="0" w:line="240" w:lineRule="auto"/>
+              <w:jc w:val="center"/>
+              <w:rPr>
+                <w:rFonts w:ascii="Arial" w:eastAsia="Times New Roman" w:hAnsi="Arial" w:cs="Arial"/>
+                <w:kern w:val="0"/>
+                <w:sz w:val="22"/>
+                <w:szCs w:val="22"/>
+                <w:lang w:val="en-SG" w:eastAsia="en-SG"/>
+                <w14:ligatures w14:val="none"/>
+              </w:rPr>
+            </w:pPr>
+            <w:r>
+              <w:rPr>
+                <w:rFonts w:ascii="Arial" w:eastAsia="Times New Roman" w:hAnsi="Arial" w:cs="Arial"/>
+                <w:kern w:val="0"/>
+                <w:sz w:val="22"/>
+                <w:szCs w:val="22"/>
+                <w:lang w:val="en-SG" w:eastAsia="en-SG"/>
+                <w14:ligatures w14:val="none"/>
+              </w:rPr>
+              <w:t>24</w:t>
+            </w:r>
+          </w:p>
+        </w:tc>
+        <w:tc>
+          <w:tcPr>
+            <w:tcW w:w="1980" w:type="dxa"/>
+            <w:tcBorders>
+              <w:top w:val="nil"/>
+              <w:left w:val="nil"/>
+              <w:bottom w:val="single" w:sz="4" w:space="0" w:color="B7B7B7"/>
+              <w:right w:val="single" w:sz="4" w:space="0" w:color="B7B7B7"/>
+            </w:tcBorders>
+            <w:noWrap/>
+            <w:vAlign w:val="bottom"/>
+            <w:hideMark/>
+          </w:tcPr>
+          <w:p>
+            <w:pPr>
+              <w:spacing w:after="0" w:line="240" w:lineRule="auto"/>
+              <w:jc w:val="center"/>
+              <w:rPr>
+                <w:rFonts w:ascii="Arial" w:eastAsia="Times New Roman" w:hAnsi="Arial" w:cs="Arial"/>
+                <w:kern w:val="0"/>
+                <w:sz w:val="22"/>
+                <w:szCs w:val="22"/>
+                <w:lang w:val="en-SG" w:eastAsia="en-SG"/>
+                <w14:ligatures w14:val="none"/>
+              </w:rPr>
+            </w:pPr>
+            <w:r>
+              <w:rPr>
+                <w:rFonts w:ascii="Arial" w:eastAsia="Times New Roman" w:hAnsi="Arial" w:cs="Arial"/>
+                <w:kern w:val="0"/>
+                <w:sz w:val="22"/>
+                <w:szCs w:val="22"/>
+                <w:lang w:val="en-SG" w:eastAsia="en-SG"/>
+                <w14:ligatures w14:val="none"/>
+              </w:rPr>
+              <w:t>2395.20</w:t>
+            </w:r>
+          </w:p>
+        </w:tc>
+      </w:tr>
+    </w:tbl>
+    <w:p>
+      <w:pPr>
+        <w:rPr>
+          <w:rFonts w:ascii="Times New Roman" w:hAnsi="Times New Roman" w:cs="Times New Roman"/>
+          <w:sz w:val="22"/>
+          <w:szCs w:val="22"/>
+          <w:lang w:val="en-PH"/>
+        </w:rPr>
+      </w:pPr>
+    </w:p>
+    <w:p>
+      <w:pPr>
+        <w:rPr>
+          <w:rFonts w:ascii="Times New Roman" w:hAnsi="Times New Roman" w:cs="Times New Roman"/>
+          <w:sz w:val="22"/>
+          <w:szCs w:val="22"/>
+        </w:rPr>
+      </w:pPr>
+      <w:r>
+        <w:rPr>
+          <w:rFonts w:ascii="Times New Roman" w:hAnsi="Times New Roman" w:cs="Times New Roman"/>
+          <w:sz w:val="22"/>
+          <w:szCs w:val="22"/>
+          <w:lang w:val="en-PH"/>
+        </w:rPr>
+        <w:t>*</w:t>
+      </w:r>
+      <w:r>
+        <w:rPr>
+          <w:rFonts w:ascii="Times New Roman" w:hAnsi="Times New Roman" w:cs="Times New Roman"/>
+          <w:b/>
+          <w:bCs/>
+          <w:sz w:val="22"/>
+          <w:szCs w:val="22"/>
+        </w:rPr>
+        <w:t xml:space="preserve"> </w:t>
+      </w:r>
+      <w:r>
+        <w:rPr>
+          <w:rFonts w:ascii="Times New Roman" w:hAnsi="Times New Roman" w:cs="Times New Roman"/>
+          <w:b/>
+          <w:bCs/>
+          <w:sz w:val="22"/>
+          <w:szCs w:val="22"/>
+        </w:rPr>
+        <w:t xml:space="preserve">Note: </w:t>
+      </w:r>
+      <w:r>
+        <w:rPr>
+          <w:rFonts w:ascii="Times New Roman" w:hAnsi="Times New Roman" w:cs="Times New Roman"/>
+          <w:sz w:val="22"/>
+          <w:szCs w:val="22"/>
+        </w:rPr>
+        <w:t xml:space="preserve">New Year's Day 2015 could not be included in this comparison </w:t>
+      </w:r>
+      <w:r>
+        <w:rPr>
+          <w:rFonts w:ascii="Times New Roman" w:hAnsi="Times New Roman" w:cs="Times New Roman"/>
+          <w:sz w:val="22"/>
+          <w:szCs w:val="22"/>
+        </w:rPr>
+        <w:t>as</w:t>
+      </w:r>
+      <w:r>
+        <w:rPr>
+          <w:rFonts w:ascii="Times New Roman" w:hAnsi="Times New Roman" w:cs="Times New Roman"/>
+          <w:sz w:val="22"/>
+          <w:szCs w:val="22"/>
+        </w:rPr>
+        <w:t xml:space="preserve"> there are zero hourly records for that date</w:t>
+      </w:r>
+      <w:r>
+        <w:rPr>
+          <w:rFonts w:ascii="Times New Roman" w:hAnsi="Times New Roman" w:cs="Times New Roman"/>
+          <w:sz w:val="22"/>
+          <w:szCs w:val="22"/>
+        </w:rPr>
+        <w:t xml:space="preserve"> due to </w:t>
+      </w:r>
+      <w:r>
+        <w:rPr>
+          <w:rFonts w:ascii="Times New Roman" w:hAnsi="Times New Roman" w:cs="Times New Roman"/>
+          <w:sz w:val="22"/>
+          <w:szCs w:val="22"/>
+        </w:rPr>
+        <w:t xml:space="preserve">large gap between 2014-08-08 and 2015-06-11 </w:t>
+      </w:r>
+      <w:r>
+        <w:rPr>
+          <w:rFonts w:ascii="Times New Roman" w:hAnsi="Times New Roman" w:cs="Times New Roman"/>
+          <w:sz w:val="22"/>
+          <w:szCs w:val="22"/>
+        </w:rPr>
+        <w:t>(~10mths). As a result, I have marked 2015 New Years day as ‘</w:t>
+      </w:r>
+      <w:r>
+        <w:rPr>
+          <w:rFonts w:ascii="Times New Roman" w:hAnsi="Times New Roman" w:cs="Times New Roman"/>
+          <w:sz w:val="22"/>
+          <w:szCs w:val="22"/>
+        </w:rPr>
+        <w:t>No data</w:t>
+      </w:r>
+      <w:r>
+        <w:rPr>
+          <w:rFonts w:ascii="Times New Roman" w:hAnsi="Times New Roman" w:cs="Times New Roman"/>
+          <w:sz w:val="22"/>
+          <w:szCs w:val="22"/>
+        </w:rPr>
+        <w:t>’.</w:t>
+      </w:r>
+    </w:p>
+    <w:p>
+      <w:pPr>
+        <w:rPr>
+          <w:rFonts w:ascii="Times New Roman" w:hAnsi="Times New Roman" w:cs="Times New Roman"/>
+          <w:sz w:val="22"/>
+          <w:szCs w:val="22"/>
+        </w:rPr>
+      </w:pPr>
+      <w:r>
+        <w:rPr>
+          <w:rFonts w:ascii="Times New Roman" w:hAnsi="Times New Roman" w:cs="Times New Roman"/>
+          <w:sz w:val="22"/>
+          <w:szCs w:val="22"/>
+        </w:rPr>
+        <w:drawing>
+          <wp:inline distT="0" distB="0" distL="0" distR="0" wp14:anchorId="2FB69EC1" wp14:editId="0BF51B9F">
+            <wp:extent cx="4445228" cy="1244664"/>
+            <wp:effectExtent l="0" t="0" r="0" b="0"/>
+            <wp:docPr id="855662992" name="Picture 1"/>
+            <wp:cNvGraphicFramePr>
+              <a:graphicFrameLocks xmlns:a="http://schemas.openxmlformats.org/drawingml/2006/main" noChangeAspect="1"/>
+            </wp:cNvGraphicFramePr>
+            <a:graphic xmlns:a="http://schemas.openxmlformats.org/drawingml/2006/main">
+              <a:graphicData uri="http://schemas.openxmlformats.org/drawingml/2006/picture">
+                <pic:pic xmlns:pic="http://schemas.openxmlformats.org/drawingml/2006/picture">
+                  <pic:nvPicPr>
+                    <pic:cNvPr id="855662992" name=""/>
+                    <pic:cNvPicPr/>
+                  </pic:nvPicPr>
+                  <pic:blipFill>
+                    <a:blip r:embed="rId7"/>
+                    <a:stretch>
+                      <a:fillRect/>
+                    </a:stretch>
+                  </pic:blipFill>
+                  <pic:spPr>
+                    <a:xfrm>
+                      <a:off x="0" y="0"/>
+                      <a:ext cx="4445228" cy="1244664"/>
+                    </a:xfrm>
+                    <a:prstGeom prst="rect">
+                      <a:avLst/>
+                    </a:prstGeom>
+                  </pic:spPr>
+                </pic:pic>
+              </a:graphicData>
+            </a:graphic>
+          </wp:inline>
+        </w:drawing>
+      </w:r>
+    </w:p>
+    <w:p>
+      <w:pPr>
+        <w:rPr>
+          <w:rFonts w:ascii="Times New Roman" w:hAnsi="Times New Roman" w:cs="Times New Roman"/>
+          <w:sz w:val="22"/>
+          <w:szCs w:val="22"/>
+          <w:lang w:val="en-PH"/>
+        </w:rPr>
+      </w:pPr>
+      <w:r>
+        <w:rPr>
+          <w:rFonts w:ascii="Times New Roman" w:hAnsi="Times New Roman" w:cs="Times New Roman"/>
+          <w:sz w:val="22"/>
+          <w:szCs w:val="22"/>
+          <w:lang w:val="en-PH"/>
+        </w:rPr>
+        <w:t>Identify notable year-on-year changes and discuss whether these changes appear relevant to traffic conditions.</w:t>
+      </w:r>
+    </w:p>
+    <w:p>
+      <w:pPr>
+        <w:rPr>
+          <w:rFonts w:ascii="Times New Roman" w:hAnsi="Times New Roman" w:cs="Times New Roman"/>
+          <w:b/>
+          <w:bCs/>
+          <w:sz w:val="22"/>
+          <w:szCs w:val="22"/>
+        </w:rPr>
+      </w:pPr>
+      <w:r>
+        <w:rPr>
+          <w:rFonts w:ascii="Times New Roman" w:hAnsi="Times New Roman" w:cs="Times New Roman"/>
+          <w:b/>
+          <w:bCs/>
+          <w:sz w:val="22"/>
+          <w:szCs w:val="22"/>
+        </w:rPr>
+        <w:t>Notable YoY Changes:</w:t>
+      </w:r>
+    </w:p>
+    <w:p>
+      <w:pPr>
+        <w:rPr>
+          <w:rFonts w:ascii="Times New Roman" w:hAnsi="Times New Roman" w:cs="Times New Roman"/>
+          <w:sz w:val="22"/>
+          <w:szCs w:val="22"/>
+        </w:rPr>
+      </w:pPr>
+      <w:r>
+        <w:rPr>
+          <w:rFonts w:ascii="Times New Roman" w:hAnsi="Times New Roman" w:cs="Times New Roman"/>
+          <w:sz w:val="22"/>
+          <w:szCs w:val="22"/>
+        </w:rPr>
+        <w:t xml:space="preserve">New Year's Day: 2016 </w:t>
+      </w:r>
+      <w:r>
+        <w:rPr>
+          <w:rFonts w:ascii="Times New Roman" w:hAnsi="Times New Roman" w:cs="Times New Roman"/>
+          <w:sz w:val="22"/>
+          <w:szCs w:val="22"/>
+        </w:rPr>
+        <w:t>-</w:t>
+      </w:r>
+      <w:r>
+        <w:rPr>
+          <w:rFonts w:ascii="Times New Roman" w:hAnsi="Times New Roman" w:cs="Times New Roman"/>
+          <w:sz w:val="22"/>
+          <w:szCs w:val="22"/>
+        </w:rPr>
+        <w:t xml:space="preserve"> 2017 warmed by </w:t>
+      </w:r>
+      <w:r>
+        <w:rPr>
+          <w:rFonts w:ascii="Times New Roman" w:hAnsi="Times New Roman" w:cs="Times New Roman"/>
+          <w:sz w:val="22"/>
+          <w:szCs w:val="22"/>
+        </w:rPr>
+        <w:t>+</w:t>
+      </w:r>
+      <w:r>
+        <w:rPr>
+          <w:rFonts w:ascii="Times New Roman" w:hAnsi="Times New Roman" w:cs="Times New Roman"/>
+          <w:sz w:val="22"/>
+          <w:szCs w:val="22"/>
+        </w:rPr>
+        <w:t>3.00</w:t>
+      </w:r>
+      <w:r>
+        <w:rPr>
+          <w:rFonts w:ascii="Times New Roman" w:hAnsi="Times New Roman" w:cs="Times New Roman"/>
+          <w:sz w:val="22"/>
+          <w:szCs w:val="22"/>
+        </w:rPr>
+        <w:t xml:space="preserve"> degrees C</w:t>
+      </w:r>
+      <w:r>
+        <w:rPr>
+          <w:rFonts w:ascii="Times New Roman" w:hAnsi="Times New Roman" w:cs="Times New Roman"/>
+          <w:sz w:val="22"/>
+          <w:szCs w:val="22"/>
+        </w:rPr>
+        <w:t xml:space="preserve"> (only one year-on-year comparison is possible, since 2015 has no data).</w:t>
+      </w:r>
+      <w:r>
+        <w:rPr>
+          <w:rFonts w:ascii="Times New Roman" w:hAnsi="Times New Roman" w:cs="Times New Roman"/>
+          <w:sz w:val="22"/>
+          <w:szCs w:val="22"/>
+        </w:rPr>
+        <w:br/>
+        <w:t xml:space="preserve">Labor Day: 2015 </w:t>
+      </w:r>
+      <w:r>
+        <w:rPr>
+          <w:rFonts w:ascii="Times New Roman" w:hAnsi="Times New Roman" w:cs="Times New Roman"/>
+          <w:sz w:val="22"/>
+          <w:szCs w:val="22"/>
+        </w:rPr>
+        <w:t>-</w:t>
+      </w:r>
+      <w:r>
+        <w:rPr>
+          <w:rFonts w:ascii="Times New Roman" w:hAnsi="Times New Roman" w:cs="Times New Roman"/>
+          <w:sz w:val="22"/>
+          <w:szCs w:val="22"/>
+        </w:rPr>
+        <w:t xml:space="preserve"> 2016 was essentially flat (−0.31</w:t>
+      </w:r>
+      <w:r>
+        <w:rPr>
+          <w:rFonts w:ascii="Times New Roman" w:hAnsi="Times New Roman" w:cs="Times New Roman"/>
+          <w:sz w:val="22"/>
+          <w:szCs w:val="22"/>
+        </w:rPr>
+        <w:t xml:space="preserve"> degrees C</w:t>
+      </w:r>
+      <w:r>
+        <w:rPr>
+          <w:rFonts w:ascii="Times New Roman" w:hAnsi="Times New Roman" w:cs="Times New Roman"/>
+          <w:sz w:val="22"/>
+          <w:szCs w:val="22"/>
+        </w:rPr>
+        <w:t>). 2016</w:t>
+      </w:r>
+      <w:r>
+        <w:rPr>
+          <w:rFonts w:ascii="Times New Roman" w:hAnsi="Times New Roman" w:cs="Times New Roman"/>
+          <w:sz w:val="22"/>
+          <w:szCs w:val="22"/>
+        </w:rPr>
+        <w:t xml:space="preserve"> </w:t>
+      </w:r>
+      <w:r>
+        <w:rPr>
+          <w:rFonts w:ascii="Times New Roman" w:hAnsi="Times New Roman" w:cs="Times New Roman"/>
+          <w:sz w:val="22"/>
+          <w:szCs w:val="22"/>
+        </w:rPr>
+        <w:t>-</w:t>
+      </w:r>
+      <w:r>
+        <w:rPr>
+          <w:rFonts w:ascii="Times New Roman" w:hAnsi="Times New Roman" w:cs="Times New Roman"/>
+          <w:sz w:val="22"/>
+          <w:szCs w:val="22"/>
+        </w:rPr>
+        <w:t xml:space="preserve"> </w:t>
+      </w:r>
+      <w:r>
+        <w:rPr>
+          <w:rFonts w:ascii="Times New Roman" w:hAnsi="Times New Roman" w:cs="Times New Roman"/>
+          <w:sz w:val="22"/>
+          <w:szCs w:val="22"/>
+        </w:rPr>
+        <w:t xml:space="preserve">2017 </w:t>
+      </w:r>
+      <w:r>
+        <w:rPr>
+          <w:rFonts w:ascii="Times New Roman" w:hAnsi="Times New Roman" w:cs="Times New Roman"/>
+          <w:sz w:val="22"/>
+          <w:szCs w:val="22"/>
+        </w:rPr>
+        <w:t xml:space="preserve">noted a drop of </w:t>
+      </w:r>
+      <w:r>
+        <w:rPr>
+          <w:rFonts w:ascii="Times New Roman" w:hAnsi="Times New Roman" w:cs="Times New Roman"/>
+          <w:sz w:val="22"/>
+          <w:szCs w:val="22"/>
+        </w:rPr>
+        <w:t>−3.72</w:t>
+      </w:r>
+      <w:r>
+        <w:rPr>
+          <w:rFonts w:ascii="Times New Roman" w:hAnsi="Times New Roman" w:cs="Times New Roman"/>
+          <w:sz w:val="22"/>
+          <w:szCs w:val="22"/>
+        </w:rPr>
+        <w:t xml:space="preserve"> degrees C</w:t>
+      </w:r>
+      <w:r>
+        <w:rPr>
+          <w:rFonts w:ascii="Times New Roman" w:hAnsi="Times New Roman" w:cs="Times New Roman"/>
+          <w:sz w:val="22"/>
+          <w:szCs w:val="22"/>
+        </w:rPr>
+        <w:t>, the largest change observed in this analysis.</w:t>
+      </w:r>
+    </w:p>
+    <w:p>
+      <w:pPr>
+        <w:rPr>
+          <w:rFonts w:ascii="Times New Roman" w:hAnsi="Times New Roman" w:cs="Times New Roman"/>
+          <w:b/>
+          <w:bCs/>
+          <w:sz w:val="22"/>
+          <w:szCs w:val="22"/>
+        </w:rPr>
+      </w:pPr>
+      <w:r>
+        <w:rPr>
+          <w:rFonts w:ascii="Times New Roman" w:hAnsi="Times New Roman" w:cs="Times New Roman"/>
+          <w:b/>
+          <w:bCs/>
+          <w:sz w:val="22"/>
+          <w:szCs w:val="22"/>
+        </w:rPr>
+        <w:t>“Whether these changes appear relevant to traffic conditions</w:t>
+      </w:r>
+      <w:r>
+        <w:rPr>
+          <w:rFonts w:ascii="Times New Roman" w:hAnsi="Times New Roman" w:cs="Times New Roman"/>
+          <w:b/>
+          <w:bCs/>
+          <w:sz w:val="22"/>
+          <w:szCs w:val="22"/>
+        </w:rPr>
+        <w:t>”:</w:t>
+      </w:r>
+    </w:p>
+    <w:p>
+      <w:pPr>
+        <w:pStyle w:val="ListParagraph"/>
+        <w:numPr>
+          <w:ilvl w:val="0"/>
+          <w:numId w:val="7"/>
+        </w:numPr>
+        <w:rPr>
+          <w:rFonts w:ascii="Times New Roman" w:hAnsi="Times New Roman" w:cs="Times New Roman"/>
+          <w:sz w:val="22"/>
+          <w:szCs w:val="22"/>
+          <w:lang w:val="en-PH"/>
+        </w:rPr>
+      </w:pPr>
+      <w:r>
+        <w:rPr>
+          <w:rFonts w:ascii="Times New Roman" w:hAnsi="Times New Roman" w:cs="Times New Roman"/>
+          <w:sz w:val="22"/>
+          <w:szCs w:val="22"/>
+        </w:rPr>
+        <w:t xml:space="preserve">For New Year's Day, average traffic volume also rose alongside the temperature increase (2016: 1,832.0 </w:t>
+      </w:r>
+      <w:r>
+        <w:rPr>
+          <w:rFonts w:ascii="Times New Roman" w:hAnsi="Times New Roman" w:cs="Times New Roman"/>
+          <w:sz w:val="22"/>
+          <w:szCs w:val="22"/>
+        </w:rPr>
+        <w:t>to</w:t>
+      </w:r>
+      <w:r>
+        <w:rPr>
+          <w:rFonts w:ascii="Times New Roman" w:hAnsi="Times New Roman" w:cs="Times New Roman"/>
+          <w:sz w:val="22"/>
+          <w:szCs w:val="22"/>
+        </w:rPr>
+        <w:t xml:space="preserve"> 2017: 2,127.6, +16.1%), which </w:t>
+      </w:r>
+      <w:r>
+        <w:rPr>
+          <w:rFonts w:ascii="Times New Roman" w:hAnsi="Times New Roman" w:cs="Times New Roman"/>
+          <w:sz w:val="22"/>
+          <w:szCs w:val="22"/>
+        </w:rPr>
+        <w:t xml:space="preserve">is </w:t>
+      </w:r>
+      <w:r>
+        <w:rPr>
+          <w:rFonts w:ascii="Times New Roman" w:hAnsi="Times New Roman" w:cs="Times New Roman"/>
+          <w:sz w:val="22"/>
+          <w:szCs w:val="22"/>
+        </w:rPr>
+        <w:t>directionally consistent with warmer weather coinciding with more traffic.</w:t>
+      </w:r>
+      <w:r>
+        <w:rPr>
+          <w:rFonts w:ascii="Times New Roman" w:hAnsi="Times New Roman" w:cs="Times New Roman"/>
+          <w:sz w:val="22"/>
+          <w:szCs w:val="22"/>
+        </w:rPr>
+        <w:t xml:space="preserve"> As</w:t>
+      </w:r>
+      <w:r>
+        <w:rPr>
+          <w:rFonts w:ascii="Times New Roman" w:hAnsi="Times New Roman" w:cs="Times New Roman"/>
+          <w:sz w:val="22"/>
+          <w:szCs w:val="22"/>
+        </w:rPr>
+        <w:t xml:space="preserve"> indicated in the previous task 2017 had the highest overall traffic of any year in the given dataset</w:t>
+      </w:r>
+      <w:r>
+        <w:rPr>
+          <w:rFonts w:ascii="Times New Roman" w:hAnsi="Times New Roman" w:cs="Times New Roman"/>
+          <w:sz w:val="22"/>
+          <w:szCs w:val="22"/>
+        </w:rPr>
+        <w:t xml:space="preserve"> and </w:t>
+      </w:r>
+      <w:r>
+        <w:rPr>
+          <w:rFonts w:ascii="Times New Roman" w:hAnsi="Times New Roman" w:cs="Times New Roman"/>
+          <w:sz w:val="22"/>
+          <w:szCs w:val="22"/>
+        </w:rPr>
+        <w:t xml:space="preserve">the temperature change </w:t>
+      </w:r>
+      <w:r>
+        <w:rPr>
+          <w:rFonts w:ascii="Times New Roman" w:hAnsi="Times New Roman" w:cs="Times New Roman"/>
+          <w:sz w:val="22"/>
+          <w:szCs w:val="22"/>
+        </w:rPr>
+        <w:t xml:space="preserve">can be considered as one of the </w:t>
+      </w:r>
+      <w:r>
+        <w:rPr>
+          <w:rFonts w:ascii="Times New Roman" w:hAnsi="Times New Roman" w:cs="Times New Roman"/>
+          <w:sz w:val="22"/>
+          <w:szCs w:val="22"/>
+        </w:rPr>
+        <w:t xml:space="preserve">factors rather than the only factor </w:t>
+      </w:r>
+      <w:r>
+        <w:rPr>
+          <w:rFonts w:ascii="Times New Roman" w:hAnsi="Times New Roman" w:cs="Times New Roman"/>
+          <w:sz w:val="22"/>
+          <w:szCs w:val="22"/>
+        </w:rPr>
+        <w:t>contributing to a YoY growth.</w:t>
+      </w:r>
+    </w:p>
+    <w:p>
+      <w:pPr>
+        <w:pStyle w:val="ListParagraph"/>
+        <w:numPr>
+          <w:ilvl w:val="0"/>
+          <w:numId w:val="7"/>
+        </w:numPr>
+        <w:rPr>
+          <w:rFonts w:ascii="Times New Roman" w:hAnsi="Times New Roman" w:cs="Times New Roman"/>
+          <w:sz w:val="22"/>
+          <w:szCs w:val="22"/>
+          <w:lang w:val="en-PH"/>
+        </w:rPr>
+      </w:pPr>
+      <w:r>
+        <w:rPr>
+          <w:rFonts w:ascii="Times New Roman" w:hAnsi="Times New Roman" w:cs="Times New Roman"/>
+          <w:sz w:val="22"/>
+          <w:szCs w:val="22"/>
+        </w:rPr>
+        <w:t xml:space="preserve">For Labor Day, the relationship </w:t>
+      </w:r>
+      <w:r>
+        <w:rPr>
+          <w:rFonts w:ascii="Times New Roman" w:hAnsi="Times New Roman" w:cs="Times New Roman"/>
+          <w:sz w:val="22"/>
+          <w:szCs w:val="22"/>
+        </w:rPr>
+        <w:t>breaks down, as the</w:t>
+      </w:r>
+      <w:r>
+        <w:rPr>
+          <w:rFonts w:ascii="Times New Roman" w:hAnsi="Times New Roman" w:cs="Times New Roman"/>
+          <w:sz w:val="22"/>
+          <w:szCs w:val="22"/>
+        </w:rPr>
+        <w:t xml:space="preserve"> average temperature </w:t>
+      </w:r>
+      <w:r>
+        <w:rPr>
+          <w:rFonts w:ascii="Times New Roman" w:hAnsi="Times New Roman" w:cs="Times New Roman"/>
+          <w:sz w:val="22"/>
+          <w:szCs w:val="22"/>
+        </w:rPr>
+        <w:t>changed only marginally</w:t>
+      </w:r>
+      <w:r>
+        <w:rPr>
+          <w:rFonts w:ascii="Times New Roman" w:hAnsi="Times New Roman" w:cs="Times New Roman"/>
+          <w:sz w:val="22"/>
+          <w:szCs w:val="22"/>
+        </w:rPr>
+        <w:t xml:space="preserve"> </w:t>
+      </w:r>
+      <w:r>
+        <w:rPr>
+          <w:rFonts w:ascii="Times New Roman" w:hAnsi="Times New Roman" w:cs="Times New Roman"/>
+          <w:sz w:val="22"/>
+          <w:szCs w:val="22"/>
+        </w:rPr>
+        <w:t>(</w:t>
+      </w:r>
+      <w:r>
+        <w:rPr>
+          <w:rFonts w:ascii="Times New Roman" w:hAnsi="Times New Roman" w:cs="Times New Roman"/>
+          <w:sz w:val="22"/>
+          <w:szCs w:val="22"/>
+        </w:rPr>
+        <w:t>a decrease of</w:t>
+      </w:r>
+      <w:r>
+        <w:rPr>
+          <w:rFonts w:ascii="Times New Roman" w:hAnsi="Times New Roman" w:cs="Times New Roman"/>
+          <w:sz w:val="22"/>
+          <w:szCs w:val="22"/>
+        </w:rPr>
+        <w:t xml:space="preserve"> -0.31 degrees C)</w:t>
+      </w:r>
+      <w:r>
+        <w:rPr>
+          <w:rFonts w:ascii="Times New Roman" w:hAnsi="Times New Roman" w:cs="Times New Roman"/>
+          <w:sz w:val="22"/>
+          <w:szCs w:val="22"/>
+        </w:rPr>
+        <w:t xml:space="preserve"> between 2015 and 2016</w:t>
+      </w:r>
+      <w:r>
+        <w:rPr>
+          <w:rFonts w:ascii="Times New Roman" w:hAnsi="Times New Roman" w:cs="Times New Roman"/>
+          <w:sz w:val="22"/>
+          <w:szCs w:val="22"/>
+        </w:rPr>
+        <w:t>. However, traffic fell by 11.5% (2,430.</w:t>
+      </w:r>
+      <w:r>
+        <w:rPr>
+          <w:rFonts w:ascii="Times New Roman" w:hAnsi="Times New Roman" w:cs="Times New Roman"/>
+          <w:sz w:val="22"/>
+          <w:szCs w:val="22"/>
+        </w:rPr>
+        <w:t xml:space="preserve">3 – 2,151.5). </w:t>
+      </w:r>
+      <w:r>
+        <w:rPr>
+          <w:rFonts w:ascii="Times New Roman" w:hAnsi="Times New Roman" w:cs="Times New Roman"/>
+          <w:sz w:val="22"/>
+          <w:szCs w:val="22"/>
+        </w:rPr>
+        <w:t xml:space="preserve">Thereafter between 2016 and 2017 </w:t>
+      </w:r>
+      <w:r>
+        <w:rPr>
+          <w:rFonts w:ascii="Times New Roman" w:hAnsi="Times New Roman" w:cs="Times New Roman"/>
+          <w:sz w:val="22"/>
+          <w:szCs w:val="22"/>
+        </w:rPr>
+        <w:t xml:space="preserve">temperature dropped sharply by ~ - 3.72 degrees C (i.e. </w:t>
+      </w:r>
+      <w:r>
+        <w:rPr>
+          <w:rFonts w:ascii="Times New Roman" w:hAnsi="Times New Roman" w:cs="Times New Roman"/>
+          <w:sz w:val="22"/>
+          <w:szCs w:val="22"/>
+        </w:rPr>
+        <w:t>relatively cooler) but traffic registered an increase of 11.3% (</w:t>
+      </w:r>
+      <w:r>
+        <w:rPr>
+          <w:rFonts w:ascii="Times New Roman" w:hAnsi="Times New Roman" w:cs="Times New Roman"/>
+          <w:sz w:val="22"/>
+          <w:szCs w:val="22"/>
+        </w:rPr>
+        <w:t>2,151.5 to 2,395.2)</w:t>
+      </w:r>
+      <w:r>
+        <w:rPr>
+          <w:rFonts w:ascii="Times New Roman" w:hAnsi="Times New Roman" w:cs="Times New Roman"/>
+          <w:sz w:val="22"/>
+          <w:szCs w:val="22"/>
+        </w:rPr>
+        <w:t xml:space="preserve"> which is contrary to what one might expect if cooler weather </w:t>
+      </w:r>
+      <w:r>
+        <w:rPr>
+          <w:rFonts w:ascii="Times New Roman" w:hAnsi="Times New Roman" w:cs="Times New Roman"/>
+          <w:sz w:val="22"/>
+          <w:szCs w:val="22"/>
+        </w:rPr>
+        <w:t xml:space="preserve">suppressed travel. </w:t>
+      </w:r>
+      <w:r>
+        <w:rPr>
+          <w:rFonts w:ascii="Times New Roman" w:hAnsi="Times New Roman" w:cs="Times New Roman"/>
+          <w:sz w:val="22"/>
+          <w:szCs w:val="22"/>
+        </w:rPr>
+        <w:t>So,</w:t>
+      </w:r>
+      <w:r>
+        <w:rPr>
+          <w:rFonts w:ascii="Times New Roman" w:hAnsi="Times New Roman" w:cs="Times New Roman"/>
+          <w:sz w:val="22"/>
+          <w:szCs w:val="22"/>
+        </w:rPr>
+        <w:t xml:space="preserve"> this </w:t>
+      </w:r>
+      <w:r>
+        <w:rPr>
+          <w:rFonts w:ascii="Times New Roman" w:hAnsi="Times New Roman" w:cs="Times New Roman"/>
+          <w:sz w:val="22"/>
+          <w:szCs w:val="22"/>
+        </w:rPr>
+        <w:t>mismatch</w:t>
+      </w:r>
+      <w:r>
+        <w:rPr>
+          <w:rFonts w:ascii="Times New Roman" w:hAnsi="Times New Roman" w:cs="Times New Roman"/>
+          <w:sz w:val="22"/>
+          <w:szCs w:val="22"/>
+        </w:rPr>
+        <w:t xml:space="preserve"> </w:t>
+      </w:r>
+      <w:r>
+        <w:rPr>
+          <w:rFonts w:ascii="Times New Roman" w:hAnsi="Times New Roman" w:cs="Times New Roman"/>
+          <w:sz w:val="22"/>
+          <w:szCs w:val="22"/>
+        </w:rPr>
+        <w:t>indicates that temperature is not a strong driver of changes in traffic for Labor Day.</w:t>
       </w:r>
     </w:p>
     <w:sectPr>
@@ -897,6 +3508,119 @@
 <file path=word/numbering.xml><?xml version="1.0" encoding="utf-8"?>
 <w:numbering xmlns:wpc="http://schemas.microsoft.com/office/word/2010/wordprocessingCanvas" xmlns:cx="http://schemas.microsoft.com/office/drawing/2014/chartex" xmlns:cx1="http://schemas.microsoft.com/office/drawing/2015/9/8/chartex" xmlns:cx2="http://schemas.microsoft.com/office/drawing/2015/10/21/chartex" xmlns:cx3="http://schemas.microsoft.com/office/drawing/2016/5/9/chartex" xmlns:cx4="http://schemas.microsoft.com/office/drawing/2016/5/10/chartex" xmlns:cx5="http://schemas.microsoft.com/office/drawing/2016/5/11/chartex" xmlns:cx6="http://schemas.microsoft.com/office/drawing/2016/5/12/chartex" xmlns:cx7="http://schemas.microsoft.com/office/drawing/2016/5/13/chartex" xmlns:cx8="http://schemas.microsoft.com/office/drawing/2016/5/14/chartex" xmlns:mc="http://schemas.openxmlformats.org/markup-compatibility/2006" xmlns:aink="http://schemas.microsoft.com/office/drawing/2016/ink" xmlns:am3d="http://schemas.microsoft.com/office/drawing/2017/model3d" xmlns:o="urn:schemas-microsoft-com:office:office" xmlns:oel="http://schemas.microsoft.com/office/2019/extlst" xmlns:r="http://schemas.openxmlformats.org/officeDocument/2006/relationships" xmlns:m="http://schemas.openxmlformats.org/officeDocument/2006/math" xmlns:v="urn:schemas-microsoft-com:vml" xmlns:wp14="http://schemas.microsoft.com/office/word/2010/wordprocessingDrawing" xmlns:wp="http://schemas.openxmlformats.org/drawingml/2006/wordprocessingDrawing" xmlns:w10="urn:schemas-microsoft-com:office:word" xmlns:w="http://schemas.openxmlformats.org/wordprocessingml/2006/main" xmlns:w14="http://schemas.microsoft.com/office/word/2010/wordml" xmlns:w15="http://schemas.microsoft.com/office/word/2012/wordml" xmlns:w16cex="http://schemas.microsoft.com/office/word/2018/wordml/cex" xmlns:w16cid="http://schemas.microsoft.com/office/word/2016/wordml/cid" xmlns:w16="http://schemas.microsoft.com/office/word/2018/wordml" xmlns:w16du="http://schemas.microsoft.com/office/word/2023/wordml/word16du" xmlns:w16sdtdh="http://schemas.microsoft.com/office/word/2020/wordml/sdtdatahash" xmlns:w16sdtfl="http://schemas.microsoft.com/office/word/2024/wordml/sdtformatlock" xmlns:w16se="http://schemas.microsoft.com/office/word/2015/wordml/symex" xmlns:wpg="http://schemas.microsoft.com/office/word/2010/wordprocessingGroup" xmlns:wpi="http://schemas.microsoft.com/office/word/2010/wordprocessingInk" xmlns:wne="http://schemas.microsoft.com/office/word/2006/wordml" xmlns:wps="http://schemas.microsoft.com/office/word/2010/wordprocessingShape" mc:Ignorable="w14 w15 w16se w16cid w16 w16cex w16sdtdh w16sdtfl w16du wp14">
   <w:abstractNum w:abstractNumId="0" w15:restartNumberingAfterBreak="0">
+    <w:nsid w:val="108A38F2"/>
+    <w:multiLevelType w:val="hybridMultilevel"/>
+    <w:tmpl w:val="94E46B62"/>
+    <w:lvl w:ilvl="0" w:tplc="48090001">
+      <w:start w:val="1"/>
+      <w:numFmt w:val="bullet"/>
+      <w:lvlText w:val=""/>
+      <w:lvlJc w:val="left"/>
+      <w:pPr>
+        <w:ind w:left="720" w:hanging="360"/>
+      </w:pPr>
+      <w:rPr>
+        <w:rFonts w:ascii="Symbol" w:hAnsi="Symbol" w:hint="default"/>
+      </w:rPr>
+    </w:lvl>
+    <w:lvl w:ilvl="1" w:tplc="48090003" w:tentative="1">
+      <w:start w:val="1"/>
+      <w:numFmt w:val="bullet"/>
+      <w:lvlText w:val="o"/>
+      <w:lvlJc w:val="left"/>
+      <w:pPr>
+        <w:ind w:left="1440" w:hanging="360"/>
+      </w:pPr>
+      <w:rPr>
+        <w:rFonts w:ascii="Courier New" w:hAnsi="Courier New" w:cs="Courier New" w:hint="default"/>
+      </w:rPr>
+    </w:lvl>
+    <w:lvl w:ilvl="2" w:tplc="48090005" w:tentative="1">
+      <w:start w:val="1"/>
+      <w:numFmt w:val="bullet"/>
+      <w:lvlText w:val=""/>
+      <w:lvlJc w:val="left"/>
+      <w:pPr>
+        <w:ind w:left="2160" w:hanging="360"/>
+      </w:pPr>
+      <w:rPr>
+        <w:rFonts w:ascii="Wingdings" w:hAnsi="Wingdings" w:hint="default"/>
+      </w:rPr>
+    </w:lvl>
+    <w:lvl w:ilvl="3" w:tplc="48090001" w:tentative="1">
+      <w:start w:val="1"/>
+      <w:numFmt w:val="bullet"/>
+      <w:lvlText w:val=""/>
+      <w:lvlJc w:val="left"/>
+      <w:pPr>
+        <w:ind w:left="2880" w:hanging="360"/>
+      </w:pPr>
+      <w:rPr>
+        <w:rFonts w:ascii="Symbol" w:hAnsi="Symbol" w:hint="default"/>
+      </w:rPr>
+    </w:lvl>
+    <w:lvl w:ilvl="4" w:tplc="48090003" w:tentative="1">
+      <w:start w:val="1"/>
+      <w:numFmt w:val="bullet"/>
+      <w:lvlText w:val="o"/>
+      <w:lvlJc w:val="left"/>
+      <w:pPr>
+        <w:ind w:left="3600" w:hanging="360"/>
+      </w:pPr>
+      <w:rPr>
+        <w:rFonts w:ascii="Courier New" w:hAnsi="Courier New" w:cs="Courier New" w:hint="default"/>
+      </w:rPr>
+    </w:lvl>
+    <w:lvl w:ilvl="5" w:tplc="48090005" w:tentative="1">
+      <w:start w:val="1"/>
+      <w:numFmt w:val="bullet"/>
+      <w:lvlText w:val=""/>
+      <w:lvlJc w:val="left"/>
+      <w:pPr>
+        <w:ind w:left="4320" w:hanging="360"/>
+      </w:pPr>
+      <w:rPr>
+        <w:rFonts w:ascii="Wingdings" w:hAnsi="Wingdings" w:hint="default"/>
+      </w:rPr>
+    </w:lvl>
+    <w:lvl w:ilvl="6" w:tplc="48090001" w:tentative="1">
+      <w:start w:val="1"/>
+      <w:numFmt w:val="bullet"/>
+      <w:lvlText w:val=""/>
+      <w:lvlJc w:val="left"/>
+      <w:pPr>
+        <w:ind w:left="5040" w:hanging="360"/>
+      </w:pPr>
+      <w:rPr>
+        <w:rFonts w:ascii="Symbol" w:hAnsi="Symbol" w:hint="default"/>
+      </w:rPr>
+    </w:lvl>
+    <w:lvl w:ilvl="7" w:tplc="48090003" w:tentative="1">
+      <w:start w:val="1"/>
+      <w:numFmt w:val="bullet"/>
+      <w:lvlText w:val="o"/>
+      <w:lvlJc w:val="left"/>
+      <w:pPr>
+        <w:ind w:left="5760" w:hanging="360"/>
+      </w:pPr>
+      <w:rPr>
+        <w:rFonts w:ascii="Courier New" w:hAnsi="Courier New" w:cs="Courier New" w:hint="default"/>
+      </w:rPr>
+    </w:lvl>
+    <w:lvl w:ilvl="8" w:tplc="48090005" w:tentative="1">
+      <w:start w:val="1"/>
+      <w:numFmt w:val="bullet"/>
+      <w:lvlText w:val=""/>
+      <w:lvlJc w:val="left"/>
+      <w:pPr>
+        <w:ind w:left="6480" w:hanging="360"/>
+      </w:pPr>
+      <w:rPr>
+        <w:rFonts w:ascii="Wingdings" w:hAnsi="Wingdings" w:hint="default"/>
+      </w:rPr>
+    </w:lvl>
+  </w:abstractNum>
+  <w:abstractNum w:abstractNumId="1" w15:restartNumberingAfterBreak="0">
     <w:nsid w:val="1F117553"/>
     <w:multiLevelType w:val="hybridMultilevel"/>
     <w:tmpl w:val="722A14DC"/>
@@ -1009,7 +3733,206 @@
       </w:rPr>
     </w:lvl>
   </w:abstractNum>
-  <w:abstractNum w:abstractNumId="1" w15:restartNumberingAfterBreak="0">
+  <w:abstractNum w:abstractNumId="2" w15:restartNumberingAfterBreak="0">
+    <w:nsid w:val="35083D96"/>
+    <w:multiLevelType w:val="hybridMultilevel"/>
+    <w:tmpl w:val="CB6452E0"/>
+    <w:lvl w:ilvl="0" w:tplc="4809000F">
+      <w:start w:val="1"/>
+      <w:numFmt w:val="decimal"/>
+      <w:lvlText w:val="%1."/>
+      <w:lvlJc w:val="left"/>
+      <w:pPr>
+        <w:ind w:left="720" w:hanging="360"/>
+      </w:pPr>
+    </w:lvl>
+    <w:lvl w:ilvl="1" w:tplc="48090019" w:tentative="1">
+      <w:start w:val="1"/>
+      <w:numFmt w:val="lowerLetter"/>
+      <w:lvlText w:val="%2."/>
+      <w:lvlJc w:val="left"/>
+      <w:pPr>
+        <w:ind w:left="1440" w:hanging="360"/>
+      </w:pPr>
+    </w:lvl>
+    <w:lvl w:ilvl="2" w:tplc="4809001B" w:tentative="1">
+      <w:start w:val="1"/>
+      <w:numFmt w:val="lowerRoman"/>
+      <w:lvlText w:val="%3."/>
+      <w:lvlJc w:val="right"/>
+      <w:pPr>
+        <w:ind w:left="2160" w:hanging="180"/>
+      </w:pPr>
+    </w:lvl>
+    <w:lvl w:ilvl="3" w:tplc="4809000F" w:tentative="1">
+      <w:start w:val="1"/>
+      <w:numFmt w:val="decimal"/>
+      <w:lvlText w:val="%4."/>
+      <w:lvlJc w:val="left"/>
+      <w:pPr>
+        <w:ind w:left="2880" w:hanging="360"/>
+      </w:pPr>
+    </w:lvl>
+    <w:lvl w:ilvl="4" w:tplc="48090019" w:tentative="1">
+      <w:start w:val="1"/>
+      <w:numFmt w:val="lowerLetter"/>
+      <w:lvlText w:val="%5."/>
+      <w:lvlJc w:val="left"/>
+      <w:pPr>
+        <w:ind w:left="3600" w:hanging="360"/>
+      </w:pPr>
+    </w:lvl>
+    <w:lvl w:ilvl="5" w:tplc="4809001B" w:tentative="1">
+      <w:start w:val="1"/>
+      <w:numFmt w:val="lowerRoman"/>
+      <w:lvlText w:val="%6."/>
+      <w:lvlJc w:val="right"/>
+      <w:pPr>
+        <w:ind w:left="4320" w:hanging="180"/>
+      </w:pPr>
+    </w:lvl>
+    <w:lvl w:ilvl="6" w:tplc="4809000F" w:tentative="1">
+      <w:start w:val="1"/>
+      <w:numFmt w:val="decimal"/>
+      <w:lvlText w:val="%7."/>
+      <w:lvlJc w:val="left"/>
+      <w:pPr>
+        <w:ind w:left="5040" w:hanging="360"/>
+      </w:pPr>
+    </w:lvl>
+    <w:lvl w:ilvl="7" w:tplc="48090019" w:tentative="1">
+      <w:start w:val="1"/>
+      <w:numFmt w:val="lowerLetter"/>
+      <w:lvlText w:val="%8."/>
+      <w:lvlJc w:val="left"/>
+      <w:pPr>
+        <w:ind w:left="5760" w:hanging="360"/>
+      </w:pPr>
+    </w:lvl>
+    <w:lvl w:ilvl="8" w:tplc="4809001B" w:tentative="1">
+      <w:start w:val="1"/>
+      <w:numFmt w:val="lowerRoman"/>
+      <w:lvlText w:val="%9."/>
+      <w:lvlJc w:val="right"/>
+      <w:pPr>
+        <w:ind w:left="6480" w:hanging="180"/>
+      </w:pPr>
+    </w:lvl>
+  </w:abstractNum>
+  <w:abstractNum w:abstractNumId="3" w15:restartNumberingAfterBreak="0">
+    <w:nsid w:val="3FFC78F8"/>
+    <w:multiLevelType w:val="hybridMultilevel"/>
+    <w:tmpl w:val="28688F7E"/>
+    <w:lvl w:ilvl="0" w:tplc="34090001">
+      <w:start w:val="1"/>
+      <w:numFmt w:val="bullet"/>
+      <w:lvlText w:val=""/>
+      <w:lvlJc w:val="left"/>
+      <w:pPr>
+        <w:ind w:left="1080" w:hanging="360"/>
+      </w:pPr>
+      <w:rPr>
+        <w:rFonts w:ascii="Symbol" w:hAnsi="Symbol" w:hint="default"/>
+      </w:rPr>
+    </w:lvl>
+    <w:lvl w:ilvl="1" w:tplc="34090003" w:tentative="1">
+      <w:start w:val="1"/>
+      <w:numFmt w:val="bullet"/>
+      <w:lvlText w:val="o"/>
+      <w:lvlJc w:val="left"/>
+      <w:pPr>
+        <w:ind w:left="1800" w:hanging="360"/>
+      </w:pPr>
+      <w:rPr>
+        <w:rFonts w:ascii="Courier New" w:hAnsi="Courier New" w:cs="Courier New" w:hint="default"/>
+      </w:rPr>
+    </w:lvl>
+    <w:lvl w:ilvl="2" w:tplc="34090005" w:tentative="1">
+      <w:start w:val="1"/>
+      <w:numFmt w:val="bullet"/>
+      <w:lvlText w:val=""/>
+      <w:lvlJc w:val="left"/>
+      <w:pPr>
+        <w:ind w:left="2520" w:hanging="360"/>
+      </w:pPr>
+      <w:rPr>
+        <w:rFonts w:ascii="Wingdings" w:hAnsi="Wingdings" w:hint="default"/>
+      </w:rPr>
+    </w:lvl>
+    <w:lvl w:ilvl="3" w:tplc="34090001" w:tentative="1">
+      <w:start w:val="1"/>
+      <w:numFmt w:val="bullet"/>
+      <w:lvlText w:val=""/>
+      <w:lvlJc w:val="left"/>
+      <w:pPr>
+        <w:ind w:left="3240" w:hanging="360"/>
+      </w:pPr>
+      <w:rPr>
+        <w:rFonts w:ascii="Symbol" w:hAnsi="Symbol" w:hint="default"/>
+      </w:rPr>
+    </w:lvl>
+    <w:lvl w:ilvl="4" w:tplc="34090003" w:tentative="1">
+      <w:start w:val="1"/>
+      <w:numFmt w:val="bullet"/>
+      <w:lvlText w:val="o"/>
+      <w:lvlJc w:val="left"/>
+      <w:pPr>
+        <w:ind w:left="3960" w:hanging="360"/>
+      </w:pPr>
+      <w:rPr>
+        <w:rFonts w:ascii="Courier New" w:hAnsi="Courier New" w:cs="Courier New" w:hint="default"/>
+      </w:rPr>
+    </w:lvl>
+    <w:lvl w:ilvl="5" w:tplc="34090005" w:tentative="1">
+      <w:start w:val="1"/>
+      <w:numFmt w:val="bullet"/>
+      <w:lvlText w:val=""/>
+      <w:lvlJc w:val="left"/>
+      <w:pPr>
+        <w:ind w:left="4680" w:hanging="360"/>
+      </w:pPr>
+      <w:rPr>
+        <w:rFonts w:ascii="Wingdings" w:hAnsi="Wingdings" w:hint="default"/>
+      </w:rPr>
+    </w:lvl>
+    <w:lvl w:ilvl="6" w:tplc="34090001" w:tentative="1">
+      <w:start w:val="1"/>
+      <w:numFmt w:val="bullet"/>
+      <w:lvlText w:val=""/>
+      <w:lvlJc w:val="left"/>
+      <w:pPr>
+        <w:ind w:left="5400" w:hanging="360"/>
+      </w:pPr>
+      <w:rPr>
+        <w:rFonts w:ascii="Symbol" w:hAnsi="Symbol" w:hint="default"/>
+      </w:rPr>
+    </w:lvl>
+    <w:lvl w:ilvl="7" w:tplc="34090003" w:tentative="1">
+      <w:start w:val="1"/>
+      <w:numFmt w:val="bullet"/>
+      <w:lvlText w:val="o"/>
+      <w:lvlJc w:val="left"/>
+      <w:pPr>
+        <w:ind w:left="6120" w:hanging="360"/>
+      </w:pPr>
+      <w:rPr>
+        <w:rFonts w:ascii="Courier New" w:hAnsi="Courier New" w:cs="Courier New" w:hint="default"/>
+      </w:rPr>
+    </w:lvl>
+    <w:lvl w:ilvl="8" w:tplc="34090005" w:tentative="1">
+      <w:start w:val="1"/>
+      <w:numFmt w:val="bullet"/>
+      <w:lvlText w:val=""/>
+      <w:lvlJc w:val="left"/>
+      <w:pPr>
+        <w:ind w:left="6840" w:hanging="360"/>
+      </w:pPr>
+      <w:rPr>
+        <w:rFonts w:ascii="Wingdings" w:hAnsi="Wingdings" w:hint="default"/>
+      </w:rPr>
+    </w:lvl>
+  </w:abstractNum>
+  <w:abstractNum w:abstractNumId="4" w15:restartNumberingAfterBreak="0">
     <w:nsid w:val="5CD93BD2"/>
     <w:multiLevelType w:val="multilevel"/>
     <w:tmpl w:val="62BAF922"/>
@@ -1158,7 +4081,7 @@
       </w:rPr>
     </w:lvl>
   </w:abstractNum>
-  <w:abstractNum w:abstractNumId="2" w15:restartNumberingAfterBreak="0">
+  <w:abstractNum w:abstractNumId="5" w15:restartNumberingAfterBreak="0">
     <w:nsid w:val="740F428C"/>
     <w:multiLevelType w:val="hybridMultilevel"/>
     <w:tmpl w:val="81E6BFDE"/>
@@ -1271,7 +4194,7 @@
       </w:rPr>
     </w:lvl>
   </w:abstractNum>
-  <w:abstractNum w:abstractNumId="3" w15:restartNumberingAfterBreak="0">
+  <w:abstractNum w:abstractNumId="6" w15:restartNumberingAfterBreak="0">
     <w:nsid w:val="7EE455F6"/>
     <w:multiLevelType w:val="hybridMultilevel"/>
     <w:tmpl w:val="17600EDA"/>
@@ -1385,16 +4308,25 @@
     </w:lvl>
   </w:abstractNum>
   <w:num w:numId="1" w16cid:durableId="1743143035">
+    <w:abstractNumId w:val="6"/>
+  </w:num>
+  <w:num w:numId="2" w16cid:durableId="1082602018">
+    <w:abstractNumId w:val="5"/>
+  </w:num>
+  <w:num w:numId="3" w16cid:durableId="1385986353">
+    <w:abstractNumId w:val="1"/>
+  </w:num>
+  <w:num w:numId="4" w16cid:durableId="411506492">
+    <w:abstractNumId w:val="4"/>
+  </w:num>
+  <w:num w:numId="5" w16cid:durableId="1222054480">
     <w:abstractNumId w:val="3"/>
   </w:num>
-  <w:num w:numId="2" w16cid:durableId="1082602018">
+  <w:num w:numId="6" w16cid:durableId="272519437">
     <w:abstractNumId w:val="2"/>
   </w:num>
-  <w:num w:numId="3" w16cid:durableId="1385986353">
+  <w:num w:numId="7" w16cid:durableId="1779643879">
     <w:abstractNumId w:val="0"/>
-  </w:num>
-  <w:num w:numId="4" w16cid:durableId="411506492">
-    <w:abstractNumId w:val="1"/>
   </w:num>
 </w:numbering>
 </file>
@@ -2341,6 +5273,25 @@
       <w14:ligatures w14:val="none"/>
     </w:rPr>
   </w:style>
+  <w:style w:type="table" w:styleId="TableGrid">
+    <w:name w:val="Table Grid"/>
+    <w:basedOn w:val="TableNormal"/>
+    <w:uiPriority w:val="39"/>
+    <w:rsid w:val="00F559FD"/>
+    <w:pPr>
+      <w:spacing w:after="0" w:line="240" w:lineRule="auto"/>
+    </w:pPr>
+    <w:tblPr>
+      <w:tblBorders>
+        <w:top w:val="single" w:sz="4" w:space="0" w:color="auto"/>
+        <w:left w:val="single" w:sz="4" w:space="0" w:color="auto"/>
+        <w:bottom w:val="single" w:sz="4" w:space="0" w:color="auto"/>
+        <w:right w:val="single" w:sz="4" w:space="0" w:color="auto"/>
+        <w:insideH w:val="single" w:sz="4" w:space="0" w:color="auto"/>
+        <w:insideV w:val="single" w:sz="4" w:space="0" w:color="auto"/>
+      </w:tblBorders>
+    </w:tblPr>
+  </w:style>
 </w:styles>
 </file>
 

</xml_diff>